<commit_message>
Proyecto 2 desarrollo de interfaces. Me he pegado un buen rato para organizarlo por ser un terco y querer hacerlo a lo bruto, pero por lo menos ha quedado bien
</commit_message>
<xml_diff>
--- a/Programación Multimedia/Tema1/Actividades/Tema 1 - Actividades.docx
+++ b/Programación Multimedia/Tema1/Actividades/Tema 1 - Actividades.docx
@@ -4,7 +4,7 @@
   <w:body>
     <w:p>
       <w:pPr>
-        <w:pStyle w:val="989"/>
+        <w:pStyle w:val="993"/>
         <w:pBdr/>
         <w:spacing/>
         <w:ind/>
@@ -51,7 +51,7 @@
     </w:p>
     <w:p>
       <w:pPr>
-        <w:pStyle w:val="990"/>
+        <w:pStyle w:val="994"/>
         <w:numPr>
           <w:ilvl w:val="0"/>
           <w:numId w:val="1"/>
@@ -315,7 +315,7 @@
     </w:p>
     <w:p>
       <w:pPr>
-        <w:pStyle w:val="988"/>
+        <w:pStyle w:val="992"/>
         <w:pBdr/>
         <w:spacing/>
         <w:ind/>
@@ -326,7 +326,7 @@
     </w:p>
     <w:p>
       <w:pPr>
-        <w:pStyle w:val="988"/>
+        <w:pStyle w:val="992"/>
         <w:pBdr/>
         <w:spacing w:before="183"/>
         <w:ind/>
@@ -337,7 +337,7 @@
     </w:p>
     <w:p>
       <w:pPr>
-        <w:pStyle w:val="990"/>
+        <w:pStyle w:val="994"/>
         <w:numPr>
           <w:ilvl w:val="0"/>
           <w:numId w:val="1"/>
@@ -674,7 +674,7 @@
     </w:p>
     <w:p>
       <w:pPr>
-        <w:pStyle w:val="988"/>
+        <w:pStyle w:val="992"/>
         <w:pBdr/>
         <w:spacing/>
         <w:ind/>
@@ -697,10 +697,15 @@
           <w:highlight w:val="none"/>
         </w:rPr>
       </w:r>
+      <w:r>
+        <w:rPr>
+          <w:highlight w:val="none"/>
+        </w:rPr>
+      </w:r>
     </w:p>
     <w:p>
       <w:pPr>
-        <w:pStyle w:val="988"/>
+        <w:pStyle w:val="992"/>
         <w:pBdr/>
         <w:spacing/>
         <w:ind/>
@@ -726,10 +731,15 @@
           <w:highlight w:val="none"/>
         </w:rPr>
       </w:r>
+      <w:r>
+        <w:rPr>
+          <w:highlight w:val="none"/>
+        </w:rPr>
+      </w:r>
     </w:p>
     <w:p>
       <w:pPr>
-        <w:pStyle w:val="988"/>
+        <w:pStyle w:val="992"/>
         <w:pBdr/>
         <w:spacing/>
         <w:ind/>
@@ -774,7 +784,7 @@
     </w:p>
     <w:p>
       <w:pPr>
-        <w:pStyle w:val="988"/>
+        <w:pStyle w:val="992"/>
         <w:pBdr/>
         <w:spacing w:before="182"/>
         <w:ind/>
@@ -785,7 +795,7 @@
     </w:p>
     <w:p>
       <w:pPr>
-        <w:pStyle w:val="990"/>
+        <w:pStyle w:val="994"/>
         <w:numPr>
           <w:ilvl w:val="0"/>
           <w:numId w:val="1"/>
@@ -837,7 +847,7 @@
     </w:p>
     <w:p>
       <w:pPr>
-        <w:pStyle w:val="990"/>
+        <w:pStyle w:val="994"/>
         <w:numPr>
           <w:ilvl w:val="1"/>
           <w:numId w:val="1"/>
@@ -976,6 +986,7 @@
           <w:bCs w:val="0"/>
           <w:sz w:val="24"/>
           <w:szCs w:val="24"/>
+          <w:highlight w:val="none"/>
         </w:rPr>
       </w:r>
       <w:r>
@@ -1047,6 +1058,7 @@
           <w:bCs w:val="0"/>
           <w:sz w:val="24"/>
           <w:szCs w:val="24"/>
+          <w:highlight w:val="none"/>
         </w:rPr>
       </w:r>
       <w:r>
@@ -1098,7 +1110,7 @@
           <w:b w:val="0"/>
           <w:bCs w:val="0"/>
           <w:sz w:val="24"/>
-          <w:highlight w:val="none"/>
+          <w:szCs w:val="24"/>
         </w:rPr>
       </w:r>
       <w:r>
@@ -1112,7 +1124,7 @@
     </w:p>
     <w:p>
       <w:pPr>
-        <w:pStyle w:val="990"/>
+        <w:pStyle w:val="994"/>
         <w:numPr>
           <w:ilvl w:val="1"/>
           <w:numId w:val="1"/>
@@ -1467,6 +1479,7 @@
           <w:bCs w:val="0"/>
           <w:sz w:val="24"/>
           <w:szCs w:val="24"/>
+          <w:highlight w:val="none"/>
         </w:rPr>
       </w:r>
       <w:r>
@@ -1527,7 +1540,7 @@
           <w:b w:val="0"/>
           <w:bCs w:val="0"/>
           <w:sz w:val="24"/>
-          <w:highlight w:val="none"/>
+          <w:szCs w:val="24"/>
         </w:rPr>
       </w:r>
       <w:r>
@@ -1541,7 +1554,7 @@
     </w:p>
     <w:p>
       <w:pPr>
-        <w:pStyle w:val="988"/>
+        <w:pStyle w:val="992"/>
         <w:pBdr/>
         <w:spacing/>
         <w:ind/>
@@ -1552,7 +1565,7 @@
     </w:p>
     <w:p>
       <w:pPr>
-        <w:pStyle w:val="988"/>
+        <w:pStyle w:val="992"/>
         <w:pBdr/>
         <w:spacing w:before="186"/>
         <w:ind/>
@@ -1563,7 +1576,7 @@
     </w:p>
     <w:p>
       <w:pPr>
-        <w:pStyle w:val="990"/>
+        <w:pStyle w:val="994"/>
         <w:numPr>
           <w:ilvl w:val="0"/>
           <w:numId w:val="1"/>
@@ -2167,10 +2180,8 @@
       </w:r>
       <w:r>
         <w:rPr>
-          <w:rFonts w:ascii="Liberation Sans" w:hAnsi="Liberation Sans" w:eastAsia="Liberation Sans" w:cs="Liberation Sans"/>
-          <w:color w:val="d5b778"/>
-          <w:sz w:val="24"/>
-          <w:highlight w:val="none"/>
+          <w:sz w:val="24"/>
+          <w:szCs w:val="24"/>
         </w:rPr>
       </w:r>
       <w:r>
@@ -2296,10 +2307,19 @@
           <w:highlight w:val="none"/>
         </w:rPr>
       </w:r>
+      <w:r>
+        <w:rPr>
+          <w:rFonts w:ascii="Liberation Sans" w:hAnsi="Liberation Sans" w:eastAsia="Liberation Sans" w:cs="Liberation Sans"/>
+          <w:color w:val="d5b778"/>
+          <w:sz w:val="24"/>
+          <w:szCs w:val="24"/>
+          <w:highlight w:val="none"/>
+        </w:rPr>
+      </w:r>
     </w:p>
     <w:p>
       <w:pPr>
-        <w:pStyle w:val="988"/>
+        <w:pStyle w:val="992"/>
         <w:pBdr/>
         <w:spacing/>
         <w:ind/>
@@ -2344,10 +2364,8 @@
       </w:r>
       <w:r>
         <w:rPr>
-          <w:rFonts w:ascii="Liberation Sans" w:hAnsi="Liberation Sans" w:eastAsia="Liberation Sans" w:cs="Liberation Sans"/>
-          <w:color w:val="d5b778"/>
-          <w:sz w:val="24"/>
-          <w:highlight w:val="none"/>
+          <w:sz w:val="24"/>
+          <w:szCs w:val="24"/>
         </w:rPr>
       </w:r>
       <w:r>
@@ -2473,10 +2491,19 @@
           <w:highlight w:val="none"/>
         </w:rPr>
       </w:r>
+      <w:r>
+        <w:rPr>
+          <w:rFonts w:ascii="Liberation Sans" w:hAnsi="Liberation Sans" w:eastAsia="Liberation Sans" w:cs="Liberation Sans"/>
+          <w:color w:val="d5b778"/>
+          <w:sz w:val="24"/>
+          <w:szCs w:val="24"/>
+          <w:highlight w:val="none"/>
+        </w:rPr>
+      </w:r>
     </w:p>
     <w:p>
       <w:pPr>
-        <w:pStyle w:val="988"/>
+        <w:pStyle w:val="992"/>
         <w:pBdr/>
         <w:spacing w:before="179"/>
         <w:ind/>
@@ -2487,7 +2514,7 @@
     </w:p>
     <w:p>
       <w:pPr>
-        <w:pStyle w:val="990"/>
+        <w:pStyle w:val="994"/>
         <w:numPr>
           <w:ilvl w:val="0"/>
           <w:numId w:val="1"/>
@@ -2849,7 +2876,7 @@
       <w:r>
         <w:rPr>
           <w:sz w:val="24"/>
-          <w:highlight w:val="none"/>
+          <w:szCs w:val="24"/>
         </w:rPr>
       </w:r>
       <w:r>
@@ -2861,7 +2888,7 @@
     </w:p>
     <w:p>
       <w:pPr>
-        <w:pStyle w:val="990"/>
+        <w:pStyle w:val="994"/>
         <w:pBdr/>
         <w:spacing w:after="0" w:line="360" w:lineRule="auto"/>
         <w:ind/>
@@ -2899,7 +2926,7 @@
     </w:p>
     <w:p>
       <w:pPr>
-        <w:pStyle w:val="990"/>
+        <w:pStyle w:val="994"/>
         <w:numPr>
           <w:ilvl w:val="0"/>
           <w:numId w:val="1"/>
@@ -3295,7 +3322,7 @@
     </w:p>
     <w:p>
       <w:pPr>
-        <w:pStyle w:val="990"/>
+        <w:pStyle w:val="994"/>
         <w:numPr>
           <w:ilvl w:val="1"/>
           <w:numId w:val="1"/>
@@ -3415,7 +3442,7 @@
     </w:p>
     <w:p>
       <w:pPr>
-        <w:pStyle w:val="990"/>
+        <w:pStyle w:val="994"/>
         <w:numPr>
           <w:ilvl w:val="2"/>
           <w:numId w:val="1"/>
@@ -3448,13 +3475,13 @@
       <w:r>
         <w:rPr>
           <w:sz w:val="24"/>
-          <w:highlight w:val="none"/>
+          <w:szCs w:val="24"/>
         </w:rPr>
       </w:r>
     </w:p>
     <w:p>
       <w:pPr>
-        <w:pStyle w:val="988"/>
+        <w:pStyle w:val="992"/>
         <w:pBdr/>
         <w:spacing w:before="23"/>
         <w:ind/>
@@ -3465,7 +3492,7 @@
     </w:p>
     <w:p>
       <w:pPr>
-        <w:pStyle w:val="990"/>
+        <w:pStyle w:val="994"/>
         <w:numPr>
           <w:ilvl w:val="1"/>
           <w:numId w:val="1"/>
@@ -3540,7 +3567,7 @@
     </w:p>
     <w:p>
       <w:pPr>
-        <w:pStyle w:val="990"/>
+        <w:pStyle w:val="994"/>
         <w:numPr>
           <w:ilvl w:val="2"/>
           <w:numId w:val="1"/>
@@ -3562,7 +3589,13 @@
           <w:sz w:val="24"/>
           <w:highlight w:val="none"/>
         </w:rPr>
-        <w:t xml:space="preserve">onResume()</w:t>
+        <w:t xml:space="preserve">onStart() </w:t>
+      </w:r>
+      <w:r>
+        <w:rPr>
+          <w:sz w:val="24"/>
+          <w:szCs w:val="24"/>
+        </w:rPr>
       </w:r>
       <w:r>
         <w:rPr>
@@ -3574,12 +3607,63 @@
         <w:rPr>
           <w:sz w:val="24"/>
           <w:highlight w:val="none"/>
+        </w:rPr>
+      </w:r>
+      <w:r>
+        <w:rPr>
+          <w:sz w:val="24"/>
+          <w:highlight w:val="none"/>
+        </w:rPr>
+      </w:r>
+      <w:r>
+        <w:rPr>
+          <w:sz w:val="24"/>
+          <w:szCs w:val="24"/>
         </w:rPr>
       </w:r>
     </w:p>
     <w:p>
       <w:pPr>
-        <w:pStyle w:val="988"/>
+        <w:pStyle w:val="994"/>
+        <w:numPr>
+          <w:ilvl w:val="2"/>
+          <w:numId w:val="1"/>
+        </w:numPr>
+        <w:pBdr/>
+        <w:tabs>
+          <w:tab w:val="left" w:leader="none" w:pos="1463"/>
+        </w:tabs>
+        <w:spacing w:after="0" w:before="0" w:line="240" w:lineRule="auto"/>
+        <w:ind w:right="0"/>
+        <w:jc w:val="both"/>
+        <w:rPr>
+          <w:sz w:val="24"/>
+          <w:szCs w:val="24"/>
+        </w:rPr>
+      </w:pPr>
+      <w:r>
+        <w:rPr>
+          <w:sz w:val="24"/>
+          <w:highlight w:val="none"/>
+        </w:rPr>
+        <w:t xml:space="preserve">onResume()</w:t>
+      </w:r>
+      <w:r>
+        <w:rPr>
+          <w:sz w:val="24"/>
+          <w:highlight w:val="none"/>
+        </w:rPr>
+      </w:r>
+      <w:r>
+        <w:rPr>
+          <w:sz w:val="24"/>
+          <w:szCs w:val="24"/>
+        </w:rPr>
+      </w:r>
+    </w:p>
+    <w:p>
+      <w:pPr>
+        <w:pStyle w:val="992"/>
         <w:pBdr/>
         <w:spacing w:before="24"/>
         <w:ind/>
@@ -3590,7 +3674,7 @@
     </w:p>
     <w:p>
       <w:pPr>
-        <w:pStyle w:val="990"/>
+        <w:pStyle w:val="994"/>
         <w:numPr>
           <w:ilvl w:val="1"/>
           <w:numId w:val="1"/>
@@ -3670,10 +3754,15 @@
           <w:sz w:val="24"/>
         </w:rPr>
       </w:r>
+      <w:r>
+        <w:rPr>
+          <w:sz w:val="24"/>
+        </w:rPr>
+      </w:r>
     </w:p>
     <w:p>
       <w:pPr>
-        <w:pStyle w:val="990"/>
+        <w:pStyle w:val="994"/>
         <w:numPr>
           <w:ilvl w:val="2"/>
           <w:numId w:val="1"/>
@@ -3681,6 +3770,7 @@
         <w:pBdr/>
         <w:tabs>
           <w:tab w:val="left" w:leader="none" w:pos="1463"/>
+          <w:tab w:val="left" w:leader="none" w:pos="2920"/>
         </w:tabs>
         <w:spacing w:after="0" w:before="0" w:line="240" w:lineRule="auto"/>
         <w:ind w:right="0"/>
@@ -3696,26 +3786,24 @@
           <w:sz w:val="24"/>
           <w:highlight w:val="none"/>
         </w:rPr>
-        <w:t xml:space="preserve">No se</w:t>
-      </w:r>
-      <w:r>
-        <w:rPr>
-          <w:spacing w:val="-2"/>
-          <w:sz w:val="24"/>
-          <w:highlight w:val="none"/>
-        </w:rPr>
-      </w:r>
-      <w:r>
-        <w:rPr>
-          <w:spacing w:val="-2"/>
-          <w:sz w:val="24"/>
-          <w:highlight w:val="none"/>
+        <w:t xml:space="preserve">No pasa nada</w:t>
+      </w:r>
+      <w:r>
+        <w:rPr>
+          <w:sz w:val="24"/>
+          <w:szCs w:val="24"/>
+        </w:rPr>
+      </w:r>
+      <w:r>
+        <w:rPr>
+          <w:sz w:val="24"/>
+          <w:szCs w:val="24"/>
         </w:rPr>
       </w:r>
     </w:p>
     <w:p>
       <w:pPr>
-        <w:pStyle w:val="988"/>
+        <w:pStyle w:val="992"/>
         <w:pBdr/>
         <w:spacing w:before="22"/>
         <w:ind/>
@@ -3726,7 +3814,7 @@
     </w:p>
     <w:p>
       <w:pPr>
-        <w:pStyle w:val="990"/>
+        <w:pStyle w:val="994"/>
         <w:numPr>
           <w:ilvl w:val="1"/>
           <w:numId w:val="1"/>
@@ -3814,7 +3902,7 @@
     </w:p>
     <w:p>
       <w:pPr>
-        <w:pStyle w:val="990"/>
+        <w:pStyle w:val="994"/>
         <w:numPr>
           <w:ilvl w:val="2"/>
           <w:numId w:val="1"/>
@@ -3836,24 +3924,18 @@
           <w:sz w:val="24"/>
           <w:highlight w:val="none"/>
         </w:rPr>
-        <w:t xml:space="preserve">onDestroy()</w:t>
-      </w:r>
-      <w:r>
-        <w:rPr>
-          <w:sz w:val="24"/>
-          <w:highlight w:val="none"/>
-        </w:rPr>
-      </w:r>
-      <w:r>
-        <w:rPr>
-          <w:sz w:val="24"/>
-          <w:highlight w:val="none"/>
+        <w:t xml:space="preserve">Se cierra directamente sin hacer nada</w:t>
+      </w:r>
+      <w:r>
+        <w:rPr>
+          <w:sz w:val="24"/>
+          <w:szCs w:val="24"/>
         </w:rPr>
       </w:r>
     </w:p>
     <w:p>
       <w:pPr>
-        <w:pStyle w:val="988"/>
+        <w:pStyle w:val="992"/>
         <w:pBdr/>
         <w:spacing/>
         <w:ind/>
@@ -3864,7 +3946,7 @@
     </w:p>
     <w:p>
       <w:pPr>
-        <w:pStyle w:val="988"/>
+        <w:pStyle w:val="992"/>
         <w:pBdr/>
         <w:spacing/>
         <w:ind/>
@@ -3875,7 +3957,7 @@
     </w:p>
     <w:p>
       <w:pPr>
-        <w:pStyle w:val="988"/>
+        <w:pStyle w:val="992"/>
         <w:pBdr/>
         <w:spacing w:before="41"/>
         <w:ind/>
@@ -3886,7 +3968,7 @@
     </w:p>
     <w:p>
       <w:pPr>
-        <w:pStyle w:val="990"/>
+        <w:pStyle w:val="994"/>
         <w:numPr>
           <w:ilvl w:val="0"/>
           <w:numId w:val="1"/>
@@ -3942,7 +4024,7 @@
     </w:p>
     <w:p>
       <w:pPr>
-        <w:pStyle w:val="988"/>
+        <w:pStyle w:val="992"/>
         <w:pBdr/>
         <w:spacing/>
         <w:ind/>
@@ -3953,7 +4035,7 @@
     </w:p>
     <w:p>
       <w:pPr>
-        <w:pStyle w:val="988"/>
+        <w:pStyle w:val="992"/>
         <w:pBdr/>
         <w:spacing w:before="183"/>
         <w:ind/>
@@ -3964,7 +4046,7 @@
     </w:p>
     <w:p>
       <w:pPr>
-        <w:pStyle w:val="990"/>
+        <w:pStyle w:val="994"/>
         <w:numPr>
           <w:ilvl w:val="0"/>
           <w:numId w:val="1"/>
@@ -4005,7 +4087,7 @@
     </w:p>
     <w:p>
       <w:pPr>
-        <w:pStyle w:val="990"/>
+        <w:pStyle w:val="994"/>
         <w:numPr>
           <w:ilvl w:val="1"/>
           <w:numId w:val="1"/>
@@ -4113,7 +4195,7 @@
     </w:p>
     <w:p>
       <w:pPr>
-        <w:pStyle w:val="988"/>
+        <w:pStyle w:val="992"/>
         <w:pBdr/>
         <w:spacing w:before="23"/>
         <w:ind/>
@@ -4124,7 +4206,7 @@
     </w:p>
     <w:p>
       <w:pPr>
-        <w:pStyle w:val="990"/>
+        <w:pStyle w:val="994"/>
         <w:numPr>
           <w:ilvl w:val="1"/>
           <w:numId w:val="1"/>
@@ -4246,7 +4328,7 @@
 <w:ftr xmlns:wpc="http://schemas.microsoft.com/office/word/2010/wordprocessingCanvas" xmlns:mc="http://schemas.openxmlformats.org/markup-compatibility/2006" xmlns:o="urn:schemas-microsoft-com:office:office" xmlns:r="http://schemas.openxmlformats.org/officeDocument/2006/relationships" xmlns:m="http://schemas.openxmlformats.org/officeDocument/2006/math" xmlns:v="urn:schemas-microsoft-com:vml" xmlns:wp14="http://schemas.microsoft.com/office/word/2010/wordprocessingDrawing" xmlns:wp="http://schemas.openxmlformats.org/drawingml/2006/wordprocessingDrawing" xmlns:w10="urn:schemas-microsoft-com:office:word" xmlns:w="http://schemas.openxmlformats.org/wordprocessingml/2006/main" xmlns:w14="http://schemas.microsoft.com/office/word/2010/wordml" xmlns:w15="http://schemas.microsoft.com/office/word/2012/wordml" xmlns:wpg="http://schemas.microsoft.com/office/word/2010/wordprocessingGroup" xmlns:wpi="http://schemas.microsoft.com/office/word/2010/wordprocessingInk" xmlns:wne="http://schemas.microsoft.com/office/word/2006/wordml" xmlns:a="http://schemas.openxmlformats.org/drawingml/2006/main" xmlns:wps="http://schemas.microsoft.com/office/word/2010/wordprocessingShape" mc:Ignorable="w14 w15 wp14">
   <w:p>
     <w:pPr>
-      <w:pStyle w:val="988"/>
+      <w:pStyle w:val="992"/>
       <w:pBdr/>
       <w:spacing w:line="200" w:lineRule="exact"/>
       <w:ind/>
@@ -4292,7 +4374,7 @@
                       <w:txbxContent>
                         <w:p>
                           <w:pPr>
-                            <w:pStyle w:val="988"/>
+                            <w:pStyle w:val="992"/>
                             <w:pBdr/>
                             <w:spacing w:before="10"/>
                             <w:ind w:left="100"/>
@@ -4353,7 +4435,7 @@
                 <w:txbxContent>
                   <w:p>
                     <w:pPr>
-                      <w:pStyle w:val="988"/>
+                      <w:pStyle w:val="992"/>
                       <w:pBdr/>
                       <w:spacing w:before="10"/>
                       <w:ind w:left="100"/>
@@ -4454,7 +4536,7 @@
 <w:hdr xmlns:wpc="http://schemas.microsoft.com/office/word/2010/wordprocessingCanvas" xmlns:mc="http://schemas.openxmlformats.org/markup-compatibility/2006" xmlns:o="urn:schemas-microsoft-com:office:office" xmlns:r="http://schemas.openxmlformats.org/officeDocument/2006/relationships" xmlns:m="http://schemas.openxmlformats.org/officeDocument/2006/math" xmlns:v="urn:schemas-microsoft-com:vml" xmlns:wp14="http://schemas.microsoft.com/office/word/2010/wordprocessingDrawing" xmlns:wp="http://schemas.openxmlformats.org/drawingml/2006/wordprocessingDrawing" xmlns:w10="urn:schemas-microsoft-com:office:word" xmlns:w="http://schemas.openxmlformats.org/wordprocessingml/2006/main" xmlns:w14="http://schemas.microsoft.com/office/word/2010/wordml" xmlns:w15="http://schemas.microsoft.com/office/word/2012/wordml" xmlns:wpg="http://schemas.microsoft.com/office/word/2010/wordprocessingGroup" xmlns:wpi="http://schemas.microsoft.com/office/word/2010/wordprocessingInk" xmlns:wne="http://schemas.microsoft.com/office/word/2006/wordml" xmlns:a="http://schemas.openxmlformats.org/drawingml/2006/main" xmlns:wps="http://schemas.microsoft.com/office/word/2010/wordprocessingShape" mc:Ignorable="w14 w15 wp14">
   <w:p>
     <w:pPr>
-      <w:pStyle w:val="988"/>
+      <w:pStyle w:val="992"/>
       <w:pBdr/>
       <w:spacing w:line="200" w:lineRule="exact"/>
       <w:ind/>
@@ -5149,7 +5231,7 @@
     <w:lsdException w:name="Bibliography" w:uiPriority="37"/>
     <w:lsdException w:name="TOC Heading" w:uiPriority="39" w:qFormat="1"/>
   </w:latentStyles>
-  <w:style w:type="table" w:styleId="799" w:default="1">
+  <w:style w:type="table" w:styleId="803" w:default="1">
     <w:name w:val="Normal Table"/>
     <w:uiPriority w:val="99"/>
     <w:semiHidden/>
@@ -5342,9 +5424,9 @@
       </w:tcPr>
     </w:tblStylePr>
   </w:style>
-  <w:style w:type="table" w:styleId="800">
+  <w:style w:type="table" w:styleId="804">
     <w:name w:val="Table Grid"/>
-    <w:basedOn w:val="799"/>
+    <w:basedOn w:val="803"/>
     <w:uiPriority w:val="59"/>
     <w:pPr>
       <w:pBdr/>
@@ -5541,9 +5623,9 @@
       </w:tcPr>
     </w:tblStylePr>
   </w:style>
-  <w:style w:type="table" w:styleId="801">
+  <w:style w:type="table" w:styleId="805">
     <w:name w:val="Table Grid Light"/>
-    <w:basedOn w:val="799"/>
+    <w:basedOn w:val="803"/>
     <w:uiPriority w:val="59"/>
     <w:pPr>
       <w:pBdr/>
@@ -5740,9 +5822,9 @@
       </w:tcPr>
     </w:tblStylePr>
   </w:style>
-  <w:style w:type="table" w:styleId="802">
+  <w:style w:type="table" w:styleId="806">
     <w:name w:val="Plain Table 1"/>
-    <w:basedOn w:val="799"/>
+    <w:basedOn w:val="803"/>
     <w:uiPriority w:val="59"/>
     <w:pPr>
       <w:pBdr/>
@@ -5965,9 +6047,9 @@
       </w:tcPr>
     </w:tblStylePr>
   </w:style>
-  <w:style w:type="table" w:styleId="803">
+  <w:style w:type="table" w:styleId="807">
     <w:name w:val="Plain Table 2"/>
-    <w:basedOn w:val="799"/>
+    <w:basedOn w:val="803"/>
     <w:uiPriority w:val="59"/>
     <w:pPr>
       <w:pBdr/>
@@ -6198,9 +6280,9 @@
       </w:tcPr>
     </w:tblStylePr>
   </w:style>
-  <w:style w:type="table" w:styleId="804">
+  <w:style w:type="table" w:styleId="808">
     <w:name w:val="Plain Table 3"/>
-    <w:basedOn w:val="799"/>
+    <w:basedOn w:val="803"/>
     <w:uiPriority w:val="99"/>
     <w:pPr>
       <w:pBdr/>
@@ -6428,9 +6510,9 @@
       </w:tcPr>
     </w:tblStylePr>
   </w:style>
-  <w:style w:type="table" w:styleId="805">
+  <w:style w:type="table" w:styleId="809">
     <w:name w:val="Plain Table 4"/>
-    <w:basedOn w:val="799"/>
+    <w:basedOn w:val="803"/>
     <w:uiPriority w:val="99"/>
     <w:pPr>
       <w:pBdr/>
@@ -6644,9 +6726,9 @@
       </w:tcPr>
     </w:tblStylePr>
   </w:style>
-  <w:style w:type="table" w:styleId="806">
+  <w:style w:type="table" w:styleId="810">
     <w:name w:val="Plain Table 5"/>
-    <w:basedOn w:val="799"/>
+    <w:basedOn w:val="803"/>
     <w:uiPriority w:val="99"/>
     <w:pPr>
       <w:pBdr/>
@@ -6877,9 +6959,9 @@
       </w:tcPr>
     </w:tblStylePr>
   </w:style>
-  <w:style w:type="table" w:styleId="807">
+  <w:style w:type="table" w:styleId="811">
     <w:name w:val="Grid Table 1 Light"/>
-    <w:basedOn w:val="799"/>
+    <w:basedOn w:val="803"/>
     <w:uiPriority w:val="99"/>
     <w:pPr>
       <w:pBdr/>
@@ -7100,9 +7182,9 @@
       </w:tcPr>
     </w:tblStylePr>
   </w:style>
-  <w:style w:type="table" w:styleId="808">
+  <w:style w:type="table" w:styleId="812">
     <w:name w:val="Grid Table 1 Light - Accent 1"/>
-    <w:basedOn w:val="799"/>
+    <w:basedOn w:val="803"/>
     <w:uiPriority w:val="99"/>
     <w:pPr>
       <w:pBdr/>
@@ -7323,9 +7405,9 @@
       </w:tcPr>
     </w:tblStylePr>
   </w:style>
-  <w:style w:type="table" w:styleId="809">
+  <w:style w:type="table" w:styleId="813">
     <w:name w:val="Grid Table 1 Light - Accent 2"/>
-    <w:basedOn w:val="799"/>
+    <w:basedOn w:val="803"/>
     <w:uiPriority w:val="99"/>
     <w:pPr>
       <w:pBdr/>
@@ -7546,9 +7628,9 @@
       </w:tcPr>
     </w:tblStylePr>
   </w:style>
-  <w:style w:type="table" w:styleId="810">
+  <w:style w:type="table" w:styleId="814">
     <w:name w:val="Grid Table 1 Light - Accent 3"/>
-    <w:basedOn w:val="799"/>
+    <w:basedOn w:val="803"/>
     <w:uiPriority w:val="99"/>
     <w:pPr>
       <w:pBdr/>
@@ -7769,9 +7851,9 @@
       </w:tcPr>
     </w:tblStylePr>
   </w:style>
-  <w:style w:type="table" w:styleId="811">
+  <w:style w:type="table" w:styleId="815">
     <w:name w:val="Grid Table 1 Light - Accent 4"/>
-    <w:basedOn w:val="799"/>
+    <w:basedOn w:val="803"/>
     <w:uiPriority w:val="99"/>
     <w:pPr>
       <w:pBdr/>
@@ -7992,9 +8074,9 @@
       </w:tcPr>
     </w:tblStylePr>
   </w:style>
-  <w:style w:type="table" w:styleId="812">
+  <w:style w:type="table" w:styleId="816">
     <w:name w:val="Grid Table 1 Light - Accent 5"/>
-    <w:basedOn w:val="799"/>
+    <w:basedOn w:val="803"/>
     <w:uiPriority w:val="99"/>
     <w:pPr>
       <w:pBdr/>
@@ -8215,9 +8297,9 @@
       </w:tcPr>
     </w:tblStylePr>
   </w:style>
-  <w:style w:type="table" w:styleId="813">
+  <w:style w:type="table" w:styleId="817">
     <w:name w:val="Grid Table 1 Light - Accent 6"/>
-    <w:basedOn w:val="799"/>
+    <w:basedOn w:val="803"/>
     <w:uiPriority w:val="99"/>
     <w:pPr>
       <w:pBdr/>
@@ -8438,9 +8520,9 @@
       </w:tcPr>
     </w:tblStylePr>
   </w:style>
-  <w:style w:type="table" w:styleId="814">
+  <w:style w:type="table" w:styleId="818">
     <w:name w:val="Grid Table 2"/>
-    <w:basedOn w:val="799"/>
+    <w:basedOn w:val="803"/>
     <w:uiPriority w:val="99"/>
     <w:pPr>
       <w:pBdr/>
@@ -8670,9 +8752,9 @@
       </w:tcPr>
     </w:tblStylePr>
   </w:style>
-  <w:style w:type="table" w:styleId="815">
+  <w:style w:type="table" w:styleId="819">
     <w:name w:val="Grid Table 2 - Accent 1"/>
-    <w:basedOn w:val="799"/>
+    <w:basedOn w:val="803"/>
     <w:uiPriority w:val="99"/>
     <w:pPr>
       <w:pBdr/>
@@ -8902,9 +8984,9 @@
       </w:tcPr>
     </w:tblStylePr>
   </w:style>
-  <w:style w:type="table" w:styleId="816">
+  <w:style w:type="table" w:styleId="820">
     <w:name w:val="Grid Table 2 - Accent 2"/>
-    <w:basedOn w:val="799"/>
+    <w:basedOn w:val="803"/>
     <w:uiPriority w:val="99"/>
     <w:pPr>
       <w:pBdr/>
@@ -9134,9 +9216,9 @@
       </w:tcPr>
     </w:tblStylePr>
   </w:style>
-  <w:style w:type="table" w:styleId="817">
+  <w:style w:type="table" w:styleId="821">
     <w:name w:val="Grid Table 2 - Accent 3"/>
-    <w:basedOn w:val="799"/>
+    <w:basedOn w:val="803"/>
     <w:uiPriority w:val="99"/>
     <w:pPr>
       <w:pBdr/>
@@ -9366,9 +9448,9 @@
       </w:tcPr>
     </w:tblStylePr>
   </w:style>
-  <w:style w:type="table" w:styleId="818">
+  <w:style w:type="table" w:styleId="822">
     <w:name w:val="Grid Table 2 - Accent 4"/>
-    <w:basedOn w:val="799"/>
+    <w:basedOn w:val="803"/>
     <w:uiPriority w:val="99"/>
     <w:pPr>
       <w:pBdr/>
@@ -9598,9 +9680,9 @@
       </w:tcPr>
     </w:tblStylePr>
   </w:style>
-  <w:style w:type="table" w:styleId="819">
+  <w:style w:type="table" w:styleId="823">
     <w:name w:val="Grid Table 2 - Accent 5"/>
-    <w:basedOn w:val="799"/>
+    <w:basedOn w:val="803"/>
     <w:uiPriority w:val="99"/>
     <w:pPr>
       <w:pBdr/>
@@ -9830,9 +9912,9 @@
       </w:tcPr>
     </w:tblStylePr>
   </w:style>
-  <w:style w:type="table" w:styleId="820">
+  <w:style w:type="table" w:styleId="824">
     <w:name w:val="Grid Table 2 - Accent 6"/>
-    <w:basedOn w:val="799"/>
+    <w:basedOn w:val="803"/>
     <w:uiPriority w:val="99"/>
     <w:pPr>
       <w:pBdr/>
@@ -10062,9 +10144,9 @@
       </w:tcPr>
     </w:tblStylePr>
   </w:style>
-  <w:style w:type="table" w:styleId="821">
+  <w:style w:type="table" w:styleId="825">
     <w:name w:val="Grid Table 3"/>
-    <w:basedOn w:val="799"/>
+    <w:basedOn w:val="803"/>
     <w:uiPriority w:val="99"/>
     <w:pPr>
       <w:pBdr/>
@@ -10307,9 +10389,9 @@
       </w:tcPr>
     </w:tblStylePr>
   </w:style>
-  <w:style w:type="table" w:styleId="822">
+  <w:style w:type="table" w:styleId="826">
     <w:name w:val="Grid Table 3 - Accent 1"/>
-    <w:basedOn w:val="799"/>
+    <w:basedOn w:val="803"/>
     <w:uiPriority w:val="99"/>
     <w:pPr>
       <w:pBdr/>
@@ -10552,9 +10634,9 @@
       </w:tcPr>
     </w:tblStylePr>
   </w:style>
-  <w:style w:type="table" w:styleId="823">
+  <w:style w:type="table" w:styleId="827">
     <w:name w:val="Grid Table 3 - Accent 2"/>
-    <w:basedOn w:val="799"/>
+    <w:basedOn w:val="803"/>
     <w:uiPriority w:val="99"/>
     <w:pPr>
       <w:pBdr/>
@@ -10797,9 +10879,9 @@
       </w:tcPr>
     </w:tblStylePr>
   </w:style>
-  <w:style w:type="table" w:styleId="824">
+  <w:style w:type="table" w:styleId="828">
     <w:name w:val="Grid Table 3 - Accent 3"/>
-    <w:basedOn w:val="799"/>
+    <w:basedOn w:val="803"/>
     <w:uiPriority w:val="99"/>
     <w:pPr>
       <w:pBdr/>
@@ -11042,9 +11124,9 @@
       </w:tcPr>
     </w:tblStylePr>
   </w:style>
-  <w:style w:type="table" w:styleId="825">
+  <w:style w:type="table" w:styleId="829">
     <w:name w:val="Grid Table 3 - Accent 4"/>
-    <w:basedOn w:val="799"/>
+    <w:basedOn w:val="803"/>
     <w:uiPriority w:val="99"/>
     <w:pPr>
       <w:pBdr/>
@@ -11287,9 +11369,9 @@
       </w:tcPr>
     </w:tblStylePr>
   </w:style>
-  <w:style w:type="table" w:styleId="826">
+  <w:style w:type="table" w:styleId="830">
     <w:name w:val="Grid Table 3 - Accent 5"/>
-    <w:basedOn w:val="799"/>
+    <w:basedOn w:val="803"/>
     <w:uiPriority w:val="99"/>
     <w:pPr>
       <w:pBdr/>
@@ -11532,9 +11614,9 @@
       </w:tcPr>
     </w:tblStylePr>
   </w:style>
-  <w:style w:type="table" w:styleId="827">
+  <w:style w:type="table" w:styleId="831">
     <w:name w:val="Grid Table 3 - Accent 6"/>
-    <w:basedOn w:val="799"/>
+    <w:basedOn w:val="803"/>
     <w:uiPriority w:val="99"/>
     <w:pPr>
       <w:pBdr/>
@@ -11777,9 +11859,9 @@
       </w:tcPr>
     </w:tblStylePr>
   </w:style>
-  <w:style w:type="table" w:styleId="828">
+  <w:style w:type="table" w:styleId="832">
     <w:name w:val="Grid Table 4"/>
-    <w:basedOn w:val="799"/>
+    <w:basedOn w:val="803"/>
     <w:uiPriority w:val="59"/>
     <w:pPr>
       <w:pBdr/>
@@ -12010,9 +12092,9 @@
       </w:tcPr>
     </w:tblStylePr>
   </w:style>
-  <w:style w:type="table" w:styleId="829">
+  <w:style w:type="table" w:styleId="833">
     <w:name w:val="Grid Table 4 - Accent 1"/>
-    <w:basedOn w:val="799"/>
+    <w:basedOn w:val="803"/>
     <w:uiPriority w:val="59"/>
     <w:pPr>
       <w:pBdr/>
@@ -12243,9 +12325,9 @@
       </w:tcPr>
     </w:tblStylePr>
   </w:style>
-  <w:style w:type="table" w:styleId="830">
+  <w:style w:type="table" w:styleId="834">
     <w:name w:val="Grid Table 4 - Accent 2"/>
-    <w:basedOn w:val="799"/>
+    <w:basedOn w:val="803"/>
     <w:uiPriority w:val="59"/>
     <w:pPr>
       <w:pBdr/>
@@ -12476,9 +12558,9 @@
       </w:tcPr>
     </w:tblStylePr>
   </w:style>
-  <w:style w:type="table" w:styleId="831">
+  <w:style w:type="table" w:styleId="835">
     <w:name w:val="Grid Table 4 - Accent 3"/>
-    <w:basedOn w:val="799"/>
+    <w:basedOn w:val="803"/>
     <w:uiPriority w:val="59"/>
     <w:pPr>
       <w:pBdr/>
@@ -12709,9 +12791,9 @@
       </w:tcPr>
     </w:tblStylePr>
   </w:style>
-  <w:style w:type="table" w:styleId="832">
+  <w:style w:type="table" w:styleId="836">
     <w:name w:val="Grid Table 4 - Accent 4"/>
-    <w:basedOn w:val="799"/>
+    <w:basedOn w:val="803"/>
     <w:uiPriority w:val="59"/>
     <w:pPr>
       <w:pBdr/>
@@ -12942,9 +13024,9 @@
       </w:tcPr>
     </w:tblStylePr>
   </w:style>
-  <w:style w:type="table" w:styleId="833">
+  <w:style w:type="table" w:styleId="837">
     <w:name w:val="Grid Table 4 - Accent 5"/>
-    <w:basedOn w:val="799"/>
+    <w:basedOn w:val="803"/>
     <w:uiPriority w:val="59"/>
     <w:pPr>
       <w:pBdr/>
@@ -13175,9 +13257,9 @@
       </w:tcPr>
     </w:tblStylePr>
   </w:style>
-  <w:style w:type="table" w:styleId="834">
+  <w:style w:type="table" w:styleId="838">
     <w:name w:val="Grid Table 4 - Accent 6"/>
-    <w:basedOn w:val="799"/>
+    <w:basedOn w:val="803"/>
     <w:uiPriority w:val="59"/>
     <w:pPr>
       <w:pBdr/>
@@ -13408,9 +13490,9 @@
       </w:tcPr>
     </w:tblStylePr>
   </w:style>
-  <w:style w:type="table" w:styleId="835">
+  <w:style w:type="table" w:styleId="839">
     <w:name w:val="Grid Table 5 Dark"/>
-    <w:basedOn w:val="799"/>
+    <w:basedOn w:val="803"/>
     <w:uiPriority w:val="99"/>
     <w:pPr>
       <w:pBdr/>
@@ -13636,9 +13718,9 @@
       </w:tcPr>
     </w:tblStylePr>
   </w:style>
-  <w:style w:type="table" w:styleId="836">
+  <w:style w:type="table" w:styleId="840">
     <w:name w:val="Grid Table 5 Dark- Accent 1"/>
-    <w:basedOn w:val="799"/>
+    <w:basedOn w:val="803"/>
     <w:uiPriority w:val="99"/>
     <w:pPr>
       <w:pBdr/>
@@ -13864,9 +13946,9 @@
       </w:tcPr>
     </w:tblStylePr>
   </w:style>
-  <w:style w:type="table" w:styleId="837">
+  <w:style w:type="table" w:styleId="841">
     <w:name w:val="Grid Table 5 Dark - Accent 2"/>
-    <w:basedOn w:val="799"/>
+    <w:basedOn w:val="803"/>
     <w:uiPriority w:val="99"/>
     <w:pPr>
       <w:pBdr/>
@@ -14092,9 +14174,9 @@
       </w:tcPr>
     </w:tblStylePr>
   </w:style>
-  <w:style w:type="table" w:styleId="838">
+  <w:style w:type="table" w:styleId="842">
     <w:name w:val="Grid Table 5 Dark - Accent 3"/>
-    <w:basedOn w:val="799"/>
+    <w:basedOn w:val="803"/>
     <w:uiPriority w:val="99"/>
     <w:pPr>
       <w:pBdr/>
@@ -14320,9 +14402,9 @@
       </w:tcPr>
     </w:tblStylePr>
   </w:style>
-  <w:style w:type="table" w:styleId="839">
+  <w:style w:type="table" w:styleId="843">
     <w:name w:val="Grid Table 5 Dark- Accent 4"/>
-    <w:basedOn w:val="799"/>
+    <w:basedOn w:val="803"/>
     <w:uiPriority w:val="99"/>
     <w:pPr>
       <w:pBdr/>
@@ -14548,9 +14630,9 @@
       </w:tcPr>
     </w:tblStylePr>
   </w:style>
-  <w:style w:type="table" w:styleId="840">
+  <w:style w:type="table" w:styleId="844">
     <w:name w:val="Grid Table 5 Dark - Accent 5"/>
-    <w:basedOn w:val="799"/>
+    <w:basedOn w:val="803"/>
     <w:uiPriority w:val="99"/>
     <w:pPr>
       <w:pBdr/>
@@ -14776,9 +14858,9 @@
       </w:tcPr>
     </w:tblStylePr>
   </w:style>
-  <w:style w:type="table" w:styleId="841">
+  <w:style w:type="table" w:styleId="845">
     <w:name w:val="Grid Table 5 Dark - Accent 6"/>
-    <w:basedOn w:val="799"/>
+    <w:basedOn w:val="803"/>
     <w:uiPriority w:val="99"/>
     <w:pPr>
       <w:pBdr/>
@@ -15004,9 +15086,9 @@
       </w:tcPr>
     </w:tblStylePr>
   </w:style>
-  <w:style w:type="table" w:styleId="842">
+  <w:style w:type="table" w:styleId="846">
     <w:name w:val="Grid Table 6 Colorful"/>
-    <w:basedOn w:val="799"/>
+    <w:basedOn w:val="803"/>
     <w:uiPriority w:val="99"/>
     <w:pPr>
       <w:pBdr/>
@@ -15234,9 +15316,9 @@
       </w:tcPr>
     </w:tblStylePr>
   </w:style>
-  <w:style w:type="table" w:styleId="843">
+  <w:style w:type="table" w:styleId="847">
     <w:name w:val="Grid Table 6 Colorful - Accent 1"/>
-    <w:basedOn w:val="799"/>
+    <w:basedOn w:val="803"/>
     <w:uiPriority w:val="99"/>
     <w:pPr>
       <w:pBdr/>
@@ -15464,9 +15546,9 @@
       </w:tcPr>
     </w:tblStylePr>
   </w:style>
-  <w:style w:type="table" w:styleId="844">
+  <w:style w:type="table" w:styleId="848">
     <w:name w:val="Grid Table 6 Colorful - Accent 2"/>
-    <w:basedOn w:val="799"/>
+    <w:basedOn w:val="803"/>
     <w:uiPriority w:val="99"/>
     <w:pPr>
       <w:pBdr/>
@@ -15694,9 +15776,9 @@
       </w:tcPr>
     </w:tblStylePr>
   </w:style>
-  <w:style w:type="table" w:styleId="845">
+  <w:style w:type="table" w:styleId="849">
     <w:name w:val="Grid Table 6 Colorful - Accent 3"/>
-    <w:basedOn w:val="799"/>
+    <w:basedOn w:val="803"/>
     <w:uiPriority w:val="99"/>
     <w:pPr>
       <w:pBdr/>
@@ -15924,9 +16006,9 @@
       </w:tcPr>
     </w:tblStylePr>
   </w:style>
-  <w:style w:type="table" w:styleId="846">
+  <w:style w:type="table" w:styleId="850">
     <w:name w:val="Grid Table 6 Colorful - Accent 4"/>
-    <w:basedOn w:val="799"/>
+    <w:basedOn w:val="803"/>
     <w:uiPriority w:val="99"/>
     <w:pPr>
       <w:pBdr/>
@@ -16154,9 +16236,9 @@
       </w:tcPr>
     </w:tblStylePr>
   </w:style>
-  <w:style w:type="table" w:styleId="847">
+  <w:style w:type="table" w:styleId="851">
     <w:name w:val="Grid Table 6 Colorful - Accent 5"/>
-    <w:basedOn w:val="799"/>
+    <w:basedOn w:val="803"/>
     <w:uiPriority w:val="99"/>
     <w:pPr>
       <w:pBdr/>
@@ -16384,9 +16466,9 @@
       </w:tcPr>
     </w:tblStylePr>
   </w:style>
-  <w:style w:type="table" w:styleId="848">
+  <w:style w:type="table" w:styleId="852">
     <w:name w:val="Grid Table 6 Colorful - Accent 6"/>
-    <w:basedOn w:val="799"/>
+    <w:basedOn w:val="803"/>
     <w:uiPriority w:val="99"/>
     <w:pPr>
       <w:pBdr/>
@@ -16614,9 +16696,9 @@
       </w:tcPr>
     </w:tblStylePr>
   </w:style>
-  <w:style w:type="table" w:styleId="849">
+  <w:style w:type="table" w:styleId="853">
     <w:name w:val="Grid Table 7 Colorful"/>
-    <w:basedOn w:val="799"/>
+    <w:basedOn w:val="803"/>
     <w:uiPriority w:val="99"/>
     <w:pPr>
       <w:pBdr/>
@@ -16868,9 +16950,9 @@
       </w:tcPr>
     </w:tblStylePr>
   </w:style>
-  <w:style w:type="table" w:styleId="850">
+  <w:style w:type="table" w:styleId="854">
     <w:name w:val="Grid Table 7 Colorful - Accent 1"/>
-    <w:basedOn w:val="799"/>
+    <w:basedOn w:val="803"/>
     <w:uiPriority w:val="99"/>
     <w:pPr>
       <w:pBdr/>
@@ -17122,9 +17204,9 @@
       </w:tcPr>
     </w:tblStylePr>
   </w:style>
-  <w:style w:type="table" w:styleId="851">
+  <w:style w:type="table" w:styleId="855">
     <w:name w:val="Grid Table 7 Colorful - Accent 2"/>
-    <w:basedOn w:val="799"/>
+    <w:basedOn w:val="803"/>
     <w:uiPriority w:val="99"/>
     <w:pPr>
       <w:pBdr/>
@@ -17376,9 +17458,9 @@
       </w:tcPr>
     </w:tblStylePr>
   </w:style>
-  <w:style w:type="table" w:styleId="852">
+  <w:style w:type="table" w:styleId="856">
     <w:name w:val="Grid Table 7 Colorful - Accent 3"/>
-    <w:basedOn w:val="799"/>
+    <w:basedOn w:val="803"/>
     <w:uiPriority w:val="99"/>
     <w:pPr>
       <w:pBdr/>
@@ -17630,9 +17712,9 @@
       </w:tcPr>
     </w:tblStylePr>
   </w:style>
-  <w:style w:type="table" w:styleId="853">
+  <w:style w:type="table" w:styleId="857">
     <w:name w:val="Grid Table 7 Colorful - Accent 4"/>
-    <w:basedOn w:val="799"/>
+    <w:basedOn w:val="803"/>
     <w:uiPriority w:val="99"/>
     <w:pPr>
       <w:pBdr/>
@@ -17884,9 +17966,9 @@
       </w:tcPr>
     </w:tblStylePr>
   </w:style>
-  <w:style w:type="table" w:styleId="854">
+  <w:style w:type="table" w:styleId="858">
     <w:name w:val="Grid Table 7 Colorful - Accent 5"/>
-    <w:basedOn w:val="799"/>
+    <w:basedOn w:val="803"/>
     <w:uiPriority w:val="99"/>
     <w:pPr>
       <w:pBdr/>
@@ -18138,9 +18220,9 @@
       </w:tcPr>
     </w:tblStylePr>
   </w:style>
-  <w:style w:type="table" w:styleId="855">
+  <w:style w:type="table" w:styleId="859">
     <w:name w:val="Grid Table 7 Colorful - Accent 6"/>
-    <w:basedOn w:val="799"/>
+    <w:basedOn w:val="803"/>
     <w:uiPriority w:val="99"/>
     <w:pPr>
       <w:pBdr/>
@@ -18392,9 +18474,9 @@
       </w:tcPr>
     </w:tblStylePr>
   </w:style>
-  <w:style w:type="table" w:styleId="856">
+  <w:style w:type="table" w:styleId="860">
     <w:name w:val="List Table 1 Light"/>
-    <w:basedOn w:val="799"/>
+    <w:basedOn w:val="803"/>
     <w:uiPriority w:val="99"/>
     <w:pPr>
       <w:pBdr/>
@@ -18608,9 +18690,9 @@
       </w:tcPr>
     </w:tblStylePr>
   </w:style>
-  <w:style w:type="table" w:styleId="857">
+  <w:style w:type="table" w:styleId="861">
     <w:name w:val="List Table 1 Light - Accent 1"/>
-    <w:basedOn w:val="799"/>
+    <w:basedOn w:val="803"/>
     <w:uiPriority w:val="99"/>
     <w:pPr>
       <w:pBdr/>
@@ -18824,9 +18906,9 @@
       </w:tcPr>
     </w:tblStylePr>
   </w:style>
-  <w:style w:type="table" w:styleId="858">
+  <w:style w:type="table" w:styleId="862">
     <w:name w:val="List Table 1 Light - Accent 2"/>
-    <w:basedOn w:val="799"/>
+    <w:basedOn w:val="803"/>
     <w:uiPriority w:val="99"/>
     <w:pPr>
       <w:pBdr/>
@@ -19040,9 +19122,9 @@
       </w:tcPr>
     </w:tblStylePr>
   </w:style>
-  <w:style w:type="table" w:styleId="859">
+  <w:style w:type="table" w:styleId="863">
     <w:name w:val="List Table 1 Light - Accent 3"/>
-    <w:basedOn w:val="799"/>
+    <w:basedOn w:val="803"/>
     <w:uiPriority w:val="99"/>
     <w:pPr>
       <w:pBdr/>
@@ -19256,9 +19338,9 @@
       </w:tcPr>
     </w:tblStylePr>
   </w:style>
-  <w:style w:type="table" w:styleId="860">
+  <w:style w:type="table" w:styleId="864">
     <w:name w:val="List Table 1 Light - Accent 4"/>
-    <w:basedOn w:val="799"/>
+    <w:basedOn w:val="803"/>
     <w:uiPriority w:val="99"/>
     <w:pPr>
       <w:pBdr/>
@@ -19472,9 +19554,9 @@
       </w:tcPr>
     </w:tblStylePr>
   </w:style>
-  <w:style w:type="table" w:styleId="861">
+  <w:style w:type="table" w:styleId="865">
     <w:name w:val="List Table 1 Light - Accent 5"/>
-    <w:basedOn w:val="799"/>
+    <w:basedOn w:val="803"/>
     <w:uiPriority w:val="99"/>
     <w:pPr>
       <w:pBdr/>
@@ -19688,9 +19770,9 @@
       </w:tcPr>
     </w:tblStylePr>
   </w:style>
-  <w:style w:type="table" w:styleId="862">
+  <w:style w:type="table" w:styleId="866">
     <w:name w:val="List Table 1 Light - Accent 6"/>
-    <w:basedOn w:val="799"/>
+    <w:basedOn w:val="803"/>
     <w:uiPriority w:val="99"/>
     <w:pPr>
       <w:pBdr/>
@@ -19904,9 +19986,9 @@
       </w:tcPr>
     </w:tblStylePr>
   </w:style>
-  <w:style w:type="table" w:styleId="863">
+  <w:style w:type="table" w:styleId="867">
     <w:name w:val="List Table 2"/>
-    <w:basedOn w:val="799"/>
+    <w:basedOn w:val="803"/>
     <w:uiPriority w:val="99"/>
     <w:pPr>
       <w:pBdr/>
@@ -20142,9 +20224,9 @@
       </w:tcPr>
     </w:tblStylePr>
   </w:style>
-  <w:style w:type="table" w:styleId="864">
+  <w:style w:type="table" w:styleId="868">
     <w:name w:val="List Table 2 - Accent 1"/>
-    <w:basedOn w:val="799"/>
+    <w:basedOn w:val="803"/>
     <w:uiPriority w:val="99"/>
     <w:pPr>
       <w:pBdr/>
@@ -20380,9 +20462,9 @@
       </w:tcPr>
     </w:tblStylePr>
   </w:style>
-  <w:style w:type="table" w:styleId="865">
+  <w:style w:type="table" w:styleId="869">
     <w:name w:val="List Table 2 - Accent 2"/>
-    <w:basedOn w:val="799"/>
+    <w:basedOn w:val="803"/>
     <w:uiPriority w:val="99"/>
     <w:pPr>
       <w:pBdr/>
@@ -20618,9 +20700,9 @@
       </w:tcPr>
     </w:tblStylePr>
   </w:style>
-  <w:style w:type="table" w:styleId="866">
+  <w:style w:type="table" w:styleId="870">
     <w:name w:val="List Table 2 - Accent 3"/>
-    <w:basedOn w:val="799"/>
+    <w:basedOn w:val="803"/>
     <w:uiPriority w:val="99"/>
     <w:pPr>
       <w:pBdr/>
@@ -20856,9 +20938,9 @@
       </w:tcPr>
     </w:tblStylePr>
   </w:style>
-  <w:style w:type="table" w:styleId="867">
+  <w:style w:type="table" w:styleId="871">
     <w:name w:val="List Table 2 - Accent 4"/>
-    <w:basedOn w:val="799"/>
+    <w:basedOn w:val="803"/>
     <w:uiPriority w:val="99"/>
     <w:pPr>
       <w:pBdr/>
@@ -21094,9 +21176,9 @@
       </w:tcPr>
     </w:tblStylePr>
   </w:style>
-  <w:style w:type="table" w:styleId="868">
+  <w:style w:type="table" w:styleId="872">
     <w:name w:val="List Table 2 - Accent 5"/>
-    <w:basedOn w:val="799"/>
+    <w:basedOn w:val="803"/>
     <w:uiPriority w:val="99"/>
     <w:pPr>
       <w:pBdr/>
@@ -21332,9 +21414,9 @@
       </w:tcPr>
     </w:tblStylePr>
   </w:style>
-  <w:style w:type="table" w:styleId="869">
+  <w:style w:type="table" w:styleId="873">
     <w:name w:val="List Table 2 - Accent 6"/>
-    <w:basedOn w:val="799"/>
+    <w:basedOn w:val="803"/>
     <w:uiPriority w:val="99"/>
     <w:pPr>
       <w:pBdr/>
@@ -21570,9 +21652,9 @@
       </w:tcPr>
     </w:tblStylePr>
   </w:style>
-  <w:style w:type="table" w:styleId="870">
+  <w:style w:type="table" w:styleId="874">
     <w:name w:val="List Table 3"/>
-    <w:basedOn w:val="799"/>
+    <w:basedOn w:val="803"/>
     <w:uiPriority w:val="99"/>
     <w:pPr>
       <w:pBdr/>
@@ -21798,9 +21880,9 @@
       </w:tcPr>
     </w:tblStylePr>
   </w:style>
-  <w:style w:type="table" w:styleId="871">
+  <w:style w:type="table" w:styleId="875">
     <w:name w:val="List Table 3 - Accent 1"/>
-    <w:basedOn w:val="799"/>
+    <w:basedOn w:val="803"/>
     <w:uiPriority w:val="99"/>
     <w:pPr>
       <w:pBdr/>
@@ -22026,9 +22108,9 @@
       </w:tcPr>
     </w:tblStylePr>
   </w:style>
-  <w:style w:type="table" w:styleId="872">
+  <w:style w:type="table" w:styleId="876">
     <w:name w:val="List Table 3 - Accent 2"/>
-    <w:basedOn w:val="799"/>
+    <w:basedOn w:val="803"/>
     <w:uiPriority w:val="99"/>
     <w:pPr>
       <w:pBdr/>
@@ -22254,9 +22336,9 @@
       </w:tcPr>
     </w:tblStylePr>
   </w:style>
-  <w:style w:type="table" w:styleId="873">
+  <w:style w:type="table" w:styleId="877">
     <w:name w:val="List Table 3 - Accent 3"/>
-    <w:basedOn w:val="799"/>
+    <w:basedOn w:val="803"/>
     <w:uiPriority w:val="99"/>
     <w:pPr>
       <w:pBdr/>
@@ -22482,9 +22564,9 @@
       </w:tcPr>
     </w:tblStylePr>
   </w:style>
-  <w:style w:type="table" w:styleId="874">
+  <w:style w:type="table" w:styleId="878">
     <w:name w:val="List Table 3 - Accent 4"/>
-    <w:basedOn w:val="799"/>
+    <w:basedOn w:val="803"/>
     <w:uiPriority w:val="99"/>
     <w:pPr>
       <w:pBdr/>
@@ -22710,9 +22792,9 @@
       </w:tcPr>
     </w:tblStylePr>
   </w:style>
-  <w:style w:type="table" w:styleId="875">
+  <w:style w:type="table" w:styleId="879">
     <w:name w:val="List Table 3 - Accent 5"/>
-    <w:basedOn w:val="799"/>
+    <w:basedOn w:val="803"/>
     <w:uiPriority w:val="99"/>
     <w:pPr>
       <w:pBdr/>
@@ -22938,9 +23020,9 @@
       </w:tcPr>
     </w:tblStylePr>
   </w:style>
-  <w:style w:type="table" w:styleId="876">
+  <w:style w:type="table" w:styleId="880">
     <w:name w:val="List Table 3 - Accent 6"/>
-    <w:basedOn w:val="799"/>
+    <w:basedOn w:val="803"/>
     <w:uiPriority w:val="99"/>
     <w:pPr>
       <w:pBdr/>
@@ -23166,9 +23248,9 @@
       </w:tcPr>
     </w:tblStylePr>
   </w:style>
-  <w:style w:type="table" w:styleId="877">
+  <w:style w:type="table" w:styleId="881">
     <w:name w:val="List Table 4"/>
-    <w:basedOn w:val="799"/>
+    <w:basedOn w:val="803"/>
     <w:uiPriority w:val="99"/>
     <w:pPr>
       <w:pBdr/>
@@ -23391,9 +23473,9 @@
       </w:tcPr>
     </w:tblStylePr>
   </w:style>
-  <w:style w:type="table" w:styleId="878">
+  <w:style w:type="table" w:styleId="882">
     <w:name w:val="List Table 4 - Accent 1"/>
-    <w:basedOn w:val="799"/>
+    <w:basedOn w:val="803"/>
     <w:uiPriority w:val="99"/>
     <w:pPr>
       <w:pBdr/>
@@ -23616,9 +23698,9 @@
       </w:tcPr>
     </w:tblStylePr>
   </w:style>
-  <w:style w:type="table" w:styleId="879">
+  <w:style w:type="table" w:styleId="883">
     <w:name w:val="List Table 4 - Accent 2"/>
-    <w:basedOn w:val="799"/>
+    <w:basedOn w:val="803"/>
     <w:uiPriority w:val="99"/>
     <w:pPr>
       <w:pBdr/>
@@ -23841,9 +23923,9 @@
       </w:tcPr>
     </w:tblStylePr>
   </w:style>
-  <w:style w:type="table" w:styleId="880">
+  <w:style w:type="table" w:styleId="884">
     <w:name w:val="List Table 4 - Accent 3"/>
-    <w:basedOn w:val="799"/>
+    <w:basedOn w:val="803"/>
     <w:uiPriority w:val="99"/>
     <w:pPr>
       <w:pBdr/>
@@ -24066,9 +24148,9 @@
       </w:tcPr>
     </w:tblStylePr>
   </w:style>
-  <w:style w:type="table" w:styleId="881">
+  <w:style w:type="table" w:styleId="885">
     <w:name w:val="List Table 4 - Accent 4"/>
-    <w:basedOn w:val="799"/>
+    <w:basedOn w:val="803"/>
     <w:uiPriority w:val="99"/>
     <w:pPr>
       <w:pBdr/>
@@ -24291,9 +24373,9 @@
       </w:tcPr>
     </w:tblStylePr>
   </w:style>
-  <w:style w:type="table" w:styleId="882">
+  <w:style w:type="table" w:styleId="886">
     <w:name w:val="List Table 4 - Accent 5"/>
-    <w:basedOn w:val="799"/>
+    <w:basedOn w:val="803"/>
     <w:uiPriority w:val="99"/>
     <w:pPr>
       <w:pBdr/>
@@ -24516,9 +24598,9 @@
       </w:tcPr>
     </w:tblStylePr>
   </w:style>
-  <w:style w:type="table" w:styleId="883">
+  <w:style w:type="table" w:styleId="887">
     <w:name w:val="List Table 4 - Accent 6"/>
-    <w:basedOn w:val="799"/>
+    <w:basedOn w:val="803"/>
     <w:uiPriority w:val="99"/>
     <w:pPr>
       <w:pBdr/>
@@ -24741,9 +24823,9 @@
       </w:tcPr>
     </w:tblStylePr>
   </w:style>
-  <w:style w:type="table" w:styleId="884">
+  <w:style w:type="table" w:styleId="888">
     <w:name w:val="List Table 5 Dark"/>
-    <w:basedOn w:val="799"/>
+    <w:basedOn w:val="803"/>
     <w:uiPriority w:val="99"/>
     <w:pPr>
       <w:pBdr/>
@@ -24983,9 +25065,9 @@
       </w:tcPr>
     </w:tblStylePr>
   </w:style>
-  <w:style w:type="table" w:styleId="885">
+  <w:style w:type="table" w:styleId="889">
     <w:name w:val="List Table 5 Dark - Accent 1"/>
-    <w:basedOn w:val="799"/>
+    <w:basedOn w:val="803"/>
     <w:uiPriority w:val="99"/>
     <w:pPr>
       <w:pBdr/>
@@ -25225,9 +25307,9 @@
       </w:tcPr>
     </w:tblStylePr>
   </w:style>
-  <w:style w:type="table" w:styleId="886">
+  <w:style w:type="table" w:styleId="890">
     <w:name w:val="List Table 5 Dark - Accent 2"/>
-    <w:basedOn w:val="799"/>
+    <w:basedOn w:val="803"/>
     <w:uiPriority w:val="99"/>
     <w:pPr>
       <w:pBdr/>
@@ -25467,9 +25549,9 @@
       </w:tcPr>
     </w:tblStylePr>
   </w:style>
-  <w:style w:type="table" w:styleId="887">
+  <w:style w:type="table" w:styleId="891">
     <w:name w:val="List Table 5 Dark - Accent 3"/>
-    <w:basedOn w:val="799"/>
+    <w:basedOn w:val="803"/>
     <w:uiPriority w:val="99"/>
     <w:pPr>
       <w:pBdr/>
@@ -25709,9 +25791,9 @@
       </w:tcPr>
     </w:tblStylePr>
   </w:style>
-  <w:style w:type="table" w:styleId="888">
+  <w:style w:type="table" w:styleId="892">
     <w:name w:val="List Table 5 Dark - Accent 4"/>
-    <w:basedOn w:val="799"/>
+    <w:basedOn w:val="803"/>
     <w:uiPriority w:val="99"/>
     <w:pPr>
       <w:pBdr/>
@@ -25951,9 +26033,9 @@
       </w:tcPr>
     </w:tblStylePr>
   </w:style>
-  <w:style w:type="table" w:styleId="889">
+  <w:style w:type="table" w:styleId="893">
     <w:name w:val="List Table 5 Dark - Accent 5"/>
-    <w:basedOn w:val="799"/>
+    <w:basedOn w:val="803"/>
     <w:uiPriority w:val="99"/>
     <w:pPr>
       <w:pBdr/>
@@ -26193,9 +26275,9 @@
       </w:tcPr>
     </w:tblStylePr>
   </w:style>
-  <w:style w:type="table" w:styleId="890">
+  <w:style w:type="table" w:styleId="894">
     <w:name w:val="List Table 5 Dark - Accent 6"/>
-    <w:basedOn w:val="799"/>
+    <w:basedOn w:val="803"/>
     <w:uiPriority w:val="99"/>
     <w:pPr>
       <w:pBdr/>
@@ -26435,9 +26517,9 @@
       </w:tcPr>
     </w:tblStylePr>
   </w:style>
-  <w:style w:type="table" w:styleId="891">
+  <w:style w:type="table" w:styleId="895">
     <w:name w:val="List Table 6 Colorful"/>
-    <w:basedOn w:val="799"/>
+    <w:basedOn w:val="803"/>
     <w:uiPriority w:val="99"/>
     <w:pPr>
       <w:pBdr/>
@@ -26658,9 +26740,9 @@
       </w:tcPr>
     </w:tblStylePr>
   </w:style>
-  <w:style w:type="table" w:styleId="892">
+  <w:style w:type="table" w:styleId="896">
     <w:name w:val="List Table 6 Colorful - Accent 1"/>
-    <w:basedOn w:val="799"/>
+    <w:basedOn w:val="803"/>
     <w:uiPriority w:val="99"/>
     <w:pPr>
       <w:pBdr/>
@@ -26881,9 +26963,9 @@
       </w:tcPr>
     </w:tblStylePr>
   </w:style>
-  <w:style w:type="table" w:styleId="893">
+  <w:style w:type="table" w:styleId="897">
     <w:name w:val="List Table 6 Colorful - Accent 2"/>
-    <w:basedOn w:val="799"/>
+    <w:basedOn w:val="803"/>
     <w:uiPriority w:val="99"/>
     <w:pPr>
       <w:pBdr/>
@@ -27104,9 +27186,9 @@
       </w:tcPr>
     </w:tblStylePr>
   </w:style>
-  <w:style w:type="table" w:styleId="894">
+  <w:style w:type="table" w:styleId="898">
     <w:name w:val="List Table 6 Colorful - Accent 3"/>
-    <w:basedOn w:val="799"/>
+    <w:basedOn w:val="803"/>
     <w:uiPriority w:val="99"/>
     <w:pPr>
       <w:pBdr/>
@@ -27327,9 +27409,9 @@
       </w:tcPr>
     </w:tblStylePr>
   </w:style>
-  <w:style w:type="table" w:styleId="895">
+  <w:style w:type="table" w:styleId="899">
     <w:name w:val="List Table 6 Colorful - Accent 4"/>
-    <w:basedOn w:val="799"/>
+    <w:basedOn w:val="803"/>
     <w:uiPriority w:val="99"/>
     <w:pPr>
       <w:pBdr/>
@@ -27550,9 +27632,9 @@
       </w:tcPr>
     </w:tblStylePr>
   </w:style>
-  <w:style w:type="table" w:styleId="896">
+  <w:style w:type="table" w:styleId="900">
     <w:name w:val="List Table 6 Colorful - Accent 5"/>
-    <w:basedOn w:val="799"/>
+    <w:basedOn w:val="803"/>
     <w:uiPriority w:val="99"/>
     <w:pPr>
       <w:pBdr/>
@@ -27773,9 +27855,9 @@
       </w:tcPr>
     </w:tblStylePr>
   </w:style>
-  <w:style w:type="table" w:styleId="897">
+  <w:style w:type="table" w:styleId="901">
     <w:name w:val="List Table 6 Colorful - Accent 6"/>
-    <w:basedOn w:val="799"/>
+    <w:basedOn w:val="803"/>
     <w:uiPriority w:val="99"/>
     <w:pPr>
       <w:pBdr/>
@@ -27996,9 +28078,9 @@
       </w:tcPr>
     </w:tblStylePr>
   </w:style>
-  <w:style w:type="table" w:styleId="898">
+  <w:style w:type="table" w:styleId="902">
     <w:name w:val="List Table 7 Colorful"/>
-    <w:basedOn w:val="799"/>
+    <w:basedOn w:val="803"/>
     <w:uiPriority w:val="99"/>
     <w:pPr>
       <w:pBdr/>
@@ -28252,9 +28334,9 @@
       </w:tcPr>
     </w:tblStylePr>
   </w:style>
-  <w:style w:type="table" w:styleId="899">
+  <w:style w:type="table" w:styleId="903">
     <w:name w:val="List Table 7 Colorful - Accent 1"/>
-    <w:basedOn w:val="799"/>
+    <w:basedOn w:val="803"/>
     <w:uiPriority w:val="99"/>
     <w:pPr>
       <w:pBdr/>
@@ -28508,9 +28590,9 @@
       </w:tcPr>
     </w:tblStylePr>
   </w:style>
-  <w:style w:type="table" w:styleId="900">
+  <w:style w:type="table" w:styleId="904">
     <w:name w:val="List Table 7 Colorful - Accent 2"/>
-    <w:basedOn w:val="799"/>
+    <w:basedOn w:val="803"/>
     <w:uiPriority w:val="99"/>
     <w:pPr>
       <w:pBdr/>
@@ -28764,9 +28846,9 @@
       </w:tcPr>
     </w:tblStylePr>
   </w:style>
-  <w:style w:type="table" w:styleId="901">
+  <w:style w:type="table" w:styleId="905">
     <w:name w:val="List Table 7 Colorful - Accent 3"/>
-    <w:basedOn w:val="799"/>
+    <w:basedOn w:val="803"/>
     <w:uiPriority w:val="99"/>
     <w:pPr>
       <w:pBdr/>
@@ -29020,9 +29102,9 @@
       </w:tcPr>
     </w:tblStylePr>
   </w:style>
-  <w:style w:type="table" w:styleId="902">
+  <w:style w:type="table" w:styleId="906">
     <w:name w:val="List Table 7 Colorful - Accent 4"/>
-    <w:basedOn w:val="799"/>
+    <w:basedOn w:val="803"/>
     <w:uiPriority w:val="99"/>
     <w:pPr>
       <w:pBdr/>
@@ -29276,9 +29358,9 @@
       </w:tcPr>
     </w:tblStylePr>
   </w:style>
-  <w:style w:type="table" w:styleId="903">
+  <w:style w:type="table" w:styleId="907">
     <w:name w:val="List Table 7 Colorful - Accent 5"/>
-    <w:basedOn w:val="799"/>
+    <w:basedOn w:val="803"/>
     <w:uiPriority w:val="99"/>
     <w:pPr>
       <w:pBdr/>
@@ -29532,9 +29614,9 @@
       </w:tcPr>
     </w:tblStylePr>
   </w:style>
-  <w:style w:type="table" w:styleId="904">
+  <w:style w:type="table" w:styleId="908">
     <w:name w:val="List Table 7 Colorful - Accent 6"/>
-    <w:basedOn w:val="799"/>
+    <w:basedOn w:val="803"/>
     <w:uiPriority w:val="99"/>
     <w:pPr>
       <w:pBdr/>
@@ -29788,9 +29870,9 @@
       </w:tcPr>
     </w:tblStylePr>
   </w:style>
-  <w:style w:type="table" w:styleId="905">
+  <w:style w:type="table" w:styleId="909">
     <w:name w:val="Lined - Accent"/>
-    <w:basedOn w:val="799"/>
+    <w:basedOn w:val="803"/>
     <w:uiPriority w:val="99"/>
     <w:pPr>
       <w:pBdr/>
@@ -30025,9 +30107,9 @@
       </w:tcPr>
     </w:tblStylePr>
   </w:style>
-  <w:style w:type="table" w:styleId="906">
+  <w:style w:type="table" w:styleId="910">
     <w:name w:val="Lined - Accent 1"/>
-    <w:basedOn w:val="799"/>
+    <w:basedOn w:val="803"/>
     <w:uiPriority w:val="99"/>
     <w:pPr>
       <w:pBdr/>
@@ -30262,9 +30344,9 @@
       </w:tcPr>
     </w:tblStylePr>
   </w:style>
-  <w:style w:type="table" w:styleId="907">
+  <w:style w:type="table" w:styleId="911">
     <w:name w:val="Lined - Accent 2"/>
-    <w:basedOn w:val="799"/>
+    <w:basedOn w:val="803"/>
     <w:uiPriority w:val="99"/>
     <w:pPr>
       <w:pBdr/>
@@ -30499,9 +30581,9 @@
       </w:tcPr>
     </w:tblStylePr>
   </w:style>
-  <w:style w:type="table" w:styleId="908">
+  <w:style w:type="table" w:styleId="912">
     <w:name w:val="Lined - Accent 3"/>
-    <w:basedOn w:val="799"/>
+    <w:basedOn w:val="803"/>
     <w:uiPriority w:val="99"/>
     <w:pPr>
       <w:pBdr/>
@@ -30736,9 +30818,9 @@
       </w:tcPr>
     </w:tblStylePr>
   </w:style>
-  <w:style w:type="table" w:styleId="909">
+  <w:style w:type="table" w:styleId="913">
     <w:name w:val="Lined - Accent 4"/>
-    <w:basedOn w:val="799"/>
+    <w:basedOn w:val="803"/>
     <w:uiPriority w:val="99"/>
     <w:pPr>
       <w:pBdr/>
@@ -30973,9 +31055,9 @@
       </w:tcPr>
     </w:tblStylePr>
   </w:style>
-  <w:style w:type="table" w:styleId="910">
+  <w:style w:type="table" w:styleId="914">
     <w:name w:val="Lined - Accent 5"/>
-    <w:basedOn w:val="799"/>
+    <w:basedOn w:val="803"/>
     <w:uiPriority w:val="99"/>
     <w:pPr>
       <w:pBdr/>
@@ -31210,9 +31292,9 @@
       </w:tcPr>
     </w:tblStylePr>
   </w:style>
-  <w:style w:type="table" w:styleId="911">
+  <w:style w:type="table" w:styleId="915">
     <w:name w:val="Lined - Accent 6"/>
-    <w:basedOn w:val="799"/>
+    <w:basedOn w:val="803"/>
     <w:uiPriority w:val="99"/>
     <w:pPr>
       <w:pBdr/>
@@ -31447,9 +31529,9 @@
       </w:tcPr>
     </w:tblStylePr>
   </w:style>
-  <w:style w:type="table" w:styleId="912">
+  <w:style w:type="table" w:styleId="916">
     <w:name w:val="Bordered &amp; Lined - Accent"/>
-    <w:basedOn w:val="799"/>
+    <w:basedOn w:val="803"/>
     <w:uiPriority w:val="99"/>
     <w:pPr>
       <w:pBdr/>
@@ -31691,9 +31773,9 @@
       </w:tcPr>
     </w:tblStylePr>
   </w:style>
-  <w:style w:type="table" w:styleId="913">
+  <w:style w:type="table" w:styleId="917">
     <w:name w:val="Bordered &amp; Lined - Accent 1"/>
-    <w:basedOn w:val="799"/>
+    <w:basedOn w:val="803"/>
     <w:uiPriority w:val="99"/>
     <w:pPr>
       <w:pBdr/>
@@ -31935,9 +32017,9 @@
       </w:tcPr>
     </w:tblStylePr>
   </w:style>
-  <w:style w:type="table" w:styleId="914">
+  <w:style w:type="table" w:styleId="918">
     <w:name w:val="Bordered &amp; Lined - Accent 2"/>
-    <w:basedOn w:val="799"/>
+    <w:basedOn w:val="803"/>
     <w:uiPriority w:val="99"/>
     <w:pPr>
       <w:pBdr/>
@@ -32179,9 +32261,9 @@
       </w:tcPr>
     </w:tblStylePr>
   </w:style>
-  <w:style w:type="table" w:styleId="915">
+  <w:style w:type="table" w:styleId="919">
     <w:name w:val="Bordered &amp; Lined - Accent 3"/>
-    <w:basedOn w:val="799"/>
+    <w:basedOn w:val="803"/>
     <w:uiPriority w:val="99"/>
     <w:pPr>
       <w:pBdr/>
@@ -32423,9 +32505,9 @@
       </w:tcPr>
     </w:tblStylePr>
   </w:style>
-  <w:style w:type="table" w:styleId="916">
+  <w:style w:type="table" w:styleId="920">
     <w:name w:val="Bordered &amp; Lined - Accent 4"/>
-    <w:basedOn w:val="799"/>
+    <w:basedOn w:val="803"/>
     <w:uiPriority w:val="99"/>
     <w:pPr>
       <w:pBdr/>
@@ -32667,9 +32749,9 @@
       </w:tcPr>
     </w:tblStylePr>
   </w:style>
-  <w:style w:type="table" w:styleId="917">
+  <w:style w:type="table" w:styleId="921">
     <w:name w:val="Bordered &amp; Lined - Accent 5"/>
-    <w:basedOn w:val="799"/>
+    <w:basedOn w:val="803"/>
     <w:uiPriority w:val="99"/>
     <w:pPr>
       <w:pBdr/>
@@ -32911,9 +32993,9 @@
       </w:tcPr>
     </w:tblStylePr>
   </w:style>
-  <w:style w:type="table" w:styleId="918">
+  <w:style w:type="table" w:styleId="922">
     <w:name w:val="Bordered &amp; Lined - Accent 6"/>
-    <w:basedOn w:val="799"/>
+    <w:basedOn w:val="803"/>
     <w:uiPriority w:val="99"/>
     <w:pPr>
       <w:pBdr/>
@@ -33155,9 +33237,9 @@
       </w:tcPr>
     </w:tblStylePr>
   </w:style>
-  <w:style w:type="table" w:styleId="919">
+  <w:style w:type="table" w:styleId="923">
     <w:name w:val="Bordered"/>
-    <w:basedOn w:val="799"/>
+    <w:basedOn w:val="803"/>
     <w:uiPriority w:val="99"/>
     <w:pPr>
       <w:pBdr/>
@@ -33386,9 +33468,9 @@
       </w:tcPr>
     </w:tblStylePr>
   </w:style>
-  <w:style w:type="table" w:styleId="920">
+  <w:style w:type="table" w:styleId="924">
     <w:name w:val="Bordered - Accent 1"/>
-    <w:basedOn w:val="799"/>
+    <w:basedOn w:val="803"/>
     <w:uiPriority w:val="99"/>
     <w:pPr>
       <w:pBdr/>
@@ -33617,9 +33699,9 @@
       </w:tcPr>
     </w:tblStylePr>
   </w:style>
-  <w:style w:type="table" w:styleId="921">
+  <w:style w:type="table" w:styleId="925">
     <w:name w:val="Bordered - Accent 2"/>
-    <w:basedOn w:val="799"/>
+    <w:basedOn w:val="803"/>
     <w:uiPriority w:val="99"/>
     <w:pPr>
       <w:pBdr/>
@@ -33848,9 +33930,9 @@
       </w:tcPr>
     </w:tblStylePr>
   </w:style>
-  <w:style w:type="table" w:styleId="922">
+  <w:style w:type="table" w:styleId="926">
     <w:name w:val="Bordered - Accent 3"/>
-    <w:basedOn w:val="799"/>
+    <w:basedOn w:val="803"/>
     <w:uiPriority w:val="99"/>
     <w:pPr>
       <w:pBdr/>
@@ -34079,9 +34161,9 @@
       </w:tcPr>
     </w:tblStylePr>
   </w:style>
-  <w:style w:type="table" w:styleId="923">
+  <w:style w:type="table" w:styleId="927">
     <w:name w:val="Bordered - Accent 4"/>
-    <w:basedOn w:val="799"/>
+    <w:basedOn w:val="803"/>
     <w:uiPriority w:val="99"/>
     <w:pPr>
       <w:pBdr/>
@@ -34310,9 +34392,9 @@
       </w:tcPr>
     </w:tblStylePr>
   </w:style>
-  <w:style w:type="table" w:styleId="924">
+  <w:style w:type="table" w:styleId="928">
     <w:name w:val="Bordered - Accent 5"/>
-    <w:basedOn w:val="799"/>
+    <w:basedOn w:val="803"/>
     <w:uiPriority w:val="99"/>
     <w:pPr>
       <w:pBdr/>
@@ -34541,9 +34623,9 @@
       </w:tcPr>
     </w:tblStylePr>
   </w:style>
-  <w:style w:type="table" w:styleId="925">
+  <w:style w:type="table" w:styleId="929">
     <w:name w:val="Bordered - Accent 6"/>
-    <w:basedOn w:val="799"/>
+    <w:basedOn w:val="803"/>
     <w:uiPriority w:val="99"/>
     <w:pPr>
       <w:pBdr/>
@@ -34772,11 +34854,11 @@
       </w:tcPr>
     </w:tblStylePr>
   </w:style>
-  <w:style w:type="paragraph" w:styleId="926">
+  <w:style w:type="paragraph" w:styleId="930">
     <w:name w:val="Heading 2"/>
-    <w:basedOn w:val="987"/>
-    <w:next w:val="987"/>
-    <w:link w:val="935"/>
+    <w:basedOn w:val="991"/>
+    <w:next w:val="991"/>
+    <w:link w:val="939"/>
     <w:uiPriority w:val="9"/>
     <w:unhideWhenUsed/>
     <w:qFormat/>
@@ -34795,11 +34877,11 @@
       <w:szCs w:val="32"/>
     </w:rPr>
   </w:style>
-  <w:style w:type="paragraph" w:styleId="927">
+  <w:style w:type="paragraph" w:styleId="931">
     <w:name w:val="Heading 3"/>
-    <w:basedOn w:val="987"/>
-    <w:next w:val="987"/>
-    <w:link w:val="936"/>
+    <w:basedOn w:val="991"/>
+    <w:next w:val="991"/>
+    <w:link w:val="940"/>
     <w:uiPriority w:val="9"/>
     <w:unhideWhenUsed/>
     <w:qFormat/>
@@ -34818,11 +34900,11 @@
       <w:szCs w:val="28"/>
     </w:rPr>
   </w:style>
-  <w:style w:type="paragraph" w:styleId="928">
+  <w:style w:type="paragraph" w:styleId="932">
     <w:name w:val="Heading 4"/>
-    <w:basedOn w:val="987"/>
-    <w:next w:val="987"/>
-    <w:link w:val="937"/>
+    <w:basedOn w:val="991"/>
+    <w:next w:val="991"/>
+    <w:link w:val="941"/>
     <w:uiPriority w:val="9"/>
     <w:unhideWhenUsed/>
     <w:qFormat/>
@@ -34841,11 +34923,11 @@
       <w:color w:val="0f4761" w:themeColor="accent1" w:themeShade="BF"/>
     </w:rPr>
   </w:style>
-  <w:style w:type="paragraph" w:styleId="929">
+  <w:style w:type="paragraph" w:styleId="933">
     <w:name w:val="Heading 5"/>
-    <w:basedOn w:val="987"/>
-    <w:next w:val="987"/>
-    <w:link w:val="938"/>
+    <w:basedOn w:val="991"/>
+    <w:next w:val="991"/>
+    <w:link w:val="942"/>
     <w:uiPriority w:val="9"/>
     <w:unhideWhenUsed/>
     <w:qFormat/>
@@ -34862,11 +34944,11 @@
       <w:color w:val="0f4761" w:themeColor="accent1" w:themeShade="BF"/>
     </w:rPr>
   </w:style>
-  <w:style w:type="paragraph" w:styleId="930">
+  <w:style w:type="paragraph" w:styleId="934">
     <w:name w:val="Heading 6"/>
-    <w:basedOn w:val="987"/>
-    <w:next w:val="987"/>
-    <w:link w:val="939"/>
+    <w:basedOn w:val="991"/>
+    <w:next w:val="991"/>
+    <w:link w:val="943"/>
     <w:uiPriority w:val="9"/>
     <w:unhideWhenUsed/>
     <w:qFormat/>
@@ -34885,11 +34967,11 @@
       <w:color w:val="595959" w:themeColor="text1" w:themeTint="A6"/>
     </w:rPr>
   </w:style>
-  <w:style w:type="paragraph" w:styleId="931">
+  <w:style w:type="paragraph" w:styleId="935">
     <w:name w:val="Heading 7"/>
-    <w:basedOn w:val="987"/>
-    <w:next w:val="987"/>
-    <w:link w:val="940"/>
+    <w:basedOn w:val="991"/>
+    <w:next w:val="991"/>
+    <w:link w:val="944"/>
     <w:uiPriority w:val="9"/>
     <w:unhideWhenUsed/>
     <w:qFormat/>
@@ -34906,11 +34988,11 @@
       <w:color w:val="595959" w:themeColor="text1" w:themeTint="A6"/>
     </w:rPr>
   </w:style>
-  <w:style w:type="paragraph" w:styleId="932">
+  <w:style w:type="paragraph" w:styleId="936">
     <w:name w:val="Heading 8"/>
-    <w:basedOn w:val="987"/>
-    <w:next w:val="987"/>
-    <w:link w:val="941"/>
+    <w:basedOn w:val="991"/>
+    <w:next w:val="991"/>
+    <w:link w:val="945"/>
     <w:uiPriority w:val="9"/>
     <w:unhideWhenUsed/>
     <w:qFormat/>
@@ -34929,11 +35011,11 @@
       <w:color w:val="272727" w:themeColor="text1" w:themeTint="D8"/>
     </w:rPr>
   </w:style>
-  <w:style w:type="paragraph" w:styleId="933">
+  <w:style w:type="paragraph" w:styleId="937">
     <w:name w:val="Heading 9"/>
-    <w:basedOn w:val="987"/>
-    <w:next w:val="987"/>
-    <w:link w:val="942"/>
+    <w:basedOn w:val="991"/>
+    <w:next w:val="991"/>
+    <w:link w:val="946"/>
     <w:uiPriority w:val="9"/>
     <w:unhideWhenUsed/>
     <w:qFormat/>
@@ -34952,10 +35034,10 @@
       <w:color w:val="272727" w:themeColor="text1" w:themeTint="D8"/>
     </w:rPr>
   </w:style>
-  <w:style w:type="character" w:styleId="934">
+  <w:style w:type="character" w:styleId="938">
     <w:name w:val="Heading 1 Char"/>
-    <w:basedOn w:val="984"/>
-    <w:link w:val="989"/>
+    <w:basedOn w:val="988"/>
+    <w:link w:val="993"/>
     <w:uiPriority w:val="9"/>
     <w:pPr>
       <w:pBdr/>
@@ -34969,10 +35051,10 @@
       <w:szCs w:val="40"/>
     </w:rPr>
   </w:style>
-  <w:style w:type="character" w:styleId="935">
+  <w:style w:type="character" w:styleId="939">
     <w:name w:val="Heading 2 Char"/>
-    <w:basedOn w:val="984"/>
-    <w:link w:val="926"/>
+    <w:basedOn w:val="988"/>
+    <w:link w:val="930"/>
     <w:uiPriority w:val="9"/>
     <w:pPr>
       <w:pBdr/>
@@ -34986,10 +35068,10 @@
       <w:szCs w:val="32"/>
     </w:rPr>
   </w:style>
-  <w:style w:type="character" w:styleId="936">
+  <w:style w:type="character" w:styleId="940">
     <w:name w:val="Heading 3 Char"/>
-    <w:basedOn w:val="984"/>
-    <w:link w:val="927"/>
+    <w:basedOn w:val="988"/>
+    <w:link w:val="931"/>
     <w:uiPriority w:val="9"/>
     <w:pPr>
       <w:pBdr/>
@@ -35003,10 +35085,10 @@
       <w:szCs w:val="28"/>
     </w:rPr>
   </w:style>
-  <w:style w:type="character" w:styleId="937">
+  <w:style w:type="character" w:styleId="941">
     <w:name w:val="Heading 4 Char"/>
-    <w:basedOn w:val="984"/>
-    <w:link w:val="928"/>
+    <w:basedOn w:val="988"/>
+    <w:link w:val="932"/>
     <w:uiPriority w:val="9"/>
     <w:pPr>
       <w:pBdr/>
@@ -35020,10 +35102,10 @@
       <w:color w:val="0f4761" w:themeColor="accent1" w:themeShade="BF"/>
     </w:rPr>
   </w:style>
-  <w:style w:type="character" w:styleId="938">
+  <w:style w:type="character" w:styleId="942">
     <w:name w:val="Heading 5 Char"/>
-    <w:basedOn w:val="984"/>
-    <w:link w:val="929"/>
+    <w:basedOn w:val="988"/>
+    <w:link w:val="933"/>
     <w:uiPriority w:val="9"/>
     <w:pPr>
       <w:pBdr/>
@@ -35035,10 +35117,10 @@
       <w:color w:val="0f4761" w:themeColor="accent1" w:themeShade="BF"/>
     </w:rPr>
   </w:style>
-  <w:style w:type="character" w:styleId="939">
+  <w:style w:type="character" w:styleId="943">
     <w:name w:val="Heading 6 Char"/>
-    <w:basedOn w:val="984"/>
-    <w:link w:val="930"/>
+    <w:basedOn w:val="988"/>
+    <w:link w:val="934"/>
     <w:uiPriority w:val="9"/>
     <w:pPr>
       <w:pBdr/>
@@ -35052,10 +35134,10 @@
       <w:color w:val="595959" w:themeColor="text1" w:themeTint="A6"/>
     </w:rPr>
   </w:style>
-  <w:style w:type="character" w:styleId="940">
+  <w:style w:type="character" w:styleId="944">
     <w:name w:val="Heading 7 Char"/>
-    <w:basedOn w:val="984"/>
-    <w:link w:val="931"/>
+    <w:basedOn w:val="988"/>
+    <w:link w:val="935"/>
     <w:uiPriority w:val="9"/>
     <w:pPr>
       <w:pBdr/>
@@ -35067,10 +35149,10 @@
       <w:color w:val="595959" w:themeColor="text1" w:themeTint="A6"/>
     </w:rPr>
   </w:style>
-  <w:style w:type="character" w:styleId="941">
+  <w:style w:type="character" w:styleId="945">
     <w:name w:val="Heading 8 Char"/>
-    <w:basedOn w:val="984"/>
-    <w:link w:val="932"/>
+    <w:basedOn w:val="988"/>
+    <w:link w:val="936"/>
     <w:uiPriority w:val="9"/>
     <w:pPr>
       <w:pBdr/>
@@ -35084,10 +35166,10 @@
       <w:color w:val="272727" w:themeColor="text1" w:themeTint="D8"/>
     </w:rPr>
   </w:style>
-  <w:style w:type="character" w:styleId="942">
+  <w:style w:type="character" w:styleId="946">
     <w:name w:val="Heading 9 Char"/>
-    <w:basedOn w:val="984"/>
-    <w:link w:val="933"/>
+    <w:basedOn w:val="988"/>
+    <w:link w:val="937"/>
     <w:uiPriority w:val="9"/>
     <w:pPr>
       <w:pBdr/>
@@ -35101,11 +35183,11 @@
       <w:color w:val="272727" w:themeColor="text1" w:themeTint="D8"/>
     </w:rPr>
   </w:style>
-  <w:style w:type="paragraph" w:styleId="943">
+  <w:style w:type="paragraph" w:styleId="947">
     <w:name w:val="Title"/>
-    <w:basedOn w:val="987"/>
-    <w:next w:val="987"/>
-    <w:link w:val="944"/>
+    <w:basedOn w:val="991"/>
+    <w:next w:val="991"/>
+    <w:link w:val="948"/>
     <w:uiPriority w:val="10"/>
     <w:qFormat/>
     <w:pPr>
@@ -35121,10 +35203,10 @@
       <w:szCs w:val="56"/>
     </w:rPr>
   </w:style>
-  <w:style w:type="character" w:styleId="944">
+  <w:style w:type="character" w:styleId="948">
     <w:name w:val="Title Char"/>
-    <w:basedOn w:val="984"/>
-    <w:link w:val="943"/>
+    <w:basedOn w:val="988"/>
+    <w:link w:val="947"/>
     <w:uiPriority w:val="10"/>
     <w:pPr>
       <w:pBdr/>
@@ -35138,11 +35220,11 @@
       <w:szCs w:val="56"/>
     </w:rPr>
   </w:style>
-  <w:style w:type="paragraph" w:styleId="945">
+  <w:style w:type="paragraph" w:styleId="949">
     <w:name w:val="Subtitle"/>
-    <w:basedOn w:val="987"/>
-    <w:next w:val="987"/>
-    <w:link w:val="946"/>
+    <w:basedOn w:val="991"/>
+    <w:next w:val="991"/>
+    <w:link w:val="950"/>
     <w:uiPriority w:val="11"/>
     <w:qFormat/>
     <w:pPr>
@@ -35160,10 +35242,10 @@
       <w:szCs w:val="28"/>
     </w:rPr>
   </w:style>
-  <w:style w:type="character" w:styleId="946">
+  <w:style w:type="character" w:styleId="950">
     <w:name w:val="Subtitle Char"/>
-    <w:basedOn w:val="984"/>
-    <w:link w:val="945"/>
+    <w:basedOn w:val="988"/>
+    <w:link w:val="949"/>
     <w:uiPriority w:val="11"/>
     <w:pPr>
       <w:pBdr/>
@@ -35177,11 +35259,11 @@
       <w:szCs w:val="28"/>
     </w:rPr>
   </w:style>
-  <w:style w:type="paragraph" w:styleId="947">
+  <w:style w:type="paragraph" w:styleId="951">
     <w:name w:val="Quote"/>
-    <w:basedOn w:val="987"/>
-    <w:next w:val="987"/>
-    <w:link w:val="948"/>
+    <w:basedOn w:val="991"/>
+    <w:next w:val="991"/>
+    <w:link w:val="952"/>
     <w:uiPriority w:val="29"/>
     <w:qFormat/>
     <w:pPr>
@@ -35196,10 +35278,10 @@
       <w:color w:val="404040" w:themeColor="text1" w:themeTint="BF"/>
     </w:rPr>
   </w:style>
-  <w:style w:type="character" w:styleId="948">
+  <w:style w:type="character" w:styleId="952">
     <w:name w:val="Quote Char"/>
-    <w:basedOn w:val="984"/>
-    <w:link w:val="947"/>
+    <w:basedOn w:val="988"/>
+    <w:link w:val="951"/>
     <w:uiPriority w:val="29"/>
     <w:pPr>
       <w:pBdr/>
@@ -35212,9 +35294,9 @@
       <w:color w:val="404040" w:themeColor="text1" w:themeTint="BF"/>
     </w:rPr>
   </w:style>
-  <w:style w:type="character" w:styleId="949">
+  <w:style w:type="character" w:styleId="953">
     <w:name w:val="Intense Emphasis"/>
-    <w:basedOn w:val="984"/>
+    <w:basedOn w:val="988"/>
     <w:uiPriority w:val="21"/>
     <w:qFormat/>
     <w:pPr>
@@ -35228,11 +35310,11 @@
       <w:color w:val="0f4761" w:themeColor="accent1" w:themeShade="BF"/>
     </w:rPr>
   </w:style>
-  <w:style w:type="paragraph" w:styleId="950">
+  <w:style w:type="paragraph" w:styleId="954">
     <w:name w:val="Intense Quote"/>
-    <w:basedOn w:val="987"/>
-    <w:next w:val="987"/>
-    <w:link w:val="951"/>
+    <w:basedOn w:val="991"/>
+    <w:next w:val="991"/>
+    <w:link w:val="955"/>
     <w:uiPriority w:val="30"/>
     <w:qFormat/>
     <w:pPr>
@@ -35250,10 +35332,10 @@
       <w:color w:val="0f4761" w:themeColor="accent1" w:themeShade="BF"/>
     </w:rPr>
   </w:style>
-  <w:style w:type="character" w:styleId="951">
+  <w:style w:type="character" w:styleId="955">
     <w:name w:val="Intense Quote Char"/>
-    <w:basedOn w:val="984"/>
-    <w:link w:val="950"/>
+    <w:basedOn w:val="988"/>
+    <w:link w:val="954"/>
     <w:uiPriority w:val="30"/>
     <w:pPr>
       <w:pBdr/>
@@ -35266,9 +35348,9 @@
       <w:color w:val="0f4761" w:themeColor="accent1" w:themeShade="BF"/>
     </w:rPr>
   </w:style>
-  <w:style w:type="character" w:styleId="952">
+  <w:style w:type="character" w:styleId="956">
     <w:name w:val="Intense Reference"/>
-    <w:basedOn w:val="984"/>
+    <w:basedOn w:val="988"/>
     <w:uiPriority w:val="32"/>
     <w:qFormat/>
     <w:pPr>
@@ -35284,9 +35366,9 @@
       <w:spacing w:val="5"/>
     </w:rPr>
   </w:style>
-  <w:style w:type="paragraph" w:styleId="953">
+  <w:style w:type="paragraph" w:styleId="957">
     <w:name w:val="No Spacing"/>
-    <w:basedOn w:val="987"/>
+    <w:basedOn w:val="991"/>
     <w:uiPriority w:val="1"/>
     <w:qFormat/>
     <w:pPr>
@@ -35295,9 +35377,9 @@
       <w:ind/>
     </w:pPr>
   </w:style>
-  <w:style w:type="character" w:styleId="954">
+  <w:style w:type="character" w:styleId="958">
     <w:name w:val="Subtle Emphasis"/>
-    <w:basedOn w:val="984"/>
+    <w:basedOn w:val="988"/>
     <w:uiPriority w:val="19"/>
     <w:qFormat/>
     <w:pPr>
@@ -35311,9 +35393,9 @@
       <w:color w:val="404040" w:themeColor="text1" w:themeTint="BF"/>
     </w:rPr>
   </w:style>
-  <w:style w:type="character" w:styleId="955">
+  <w:style w:type="character" w:styleId="959">
     <w:name w:val="Emphasis"/>
-    <w:basedOn w:val="984"/>
+    <w:basedOn w:val="988"/>
     <w:uiPriority w:val="20"/>
     <w:qFormat/>
     <w:pPr>
@@ -35326,9 +35408,9 @@
       <w:iCs/>
     </w:rPr>
   </w:style>
-  <w:style w:type="character" w:styleId="956">
+  <w:style w:type="character" w:styleId="960">
     <w:name w:val="Strong"/>
-    <w:basedOn w:val="984"/>
+    <w:basedOn w:val="988"/>
     <w:uiPriority w:val="22"/>
     <w:qFormat/>
     <w:pPr>
@@ -35341,9 +35423,9 @@
       <w:bCs/>
     </w:rPr>
   </w:style>
-  <w:style w:type="character" w:styleId="957">
+  <w:style w:type="character" w:styleId="961">
     <w:name w:val="Subtle Reference"/>
-    <w:basedOn w:val="984"/>
+    <w:basedOn w:val="988"/>
     <w:uiPriority w:val="31"/>
     <w:qFormat/>
     <w:pPr>
@@ -35356,9 +35438,9 @@
       <w:color w:val="5a5a5a" w:themeColor="text1" w:themeTint="A5"/>
     </w:rPr>
   </w:style>
-  <w:style w:type="character" w:styleId="958">
+  <w:style w:type="character" w:styleId="962">
     <w:name w:val="Book Title"/>
-    <w:basedOn w:val="984"/>
+    <w:basedOn w:val="988"/>
     <w:uiPriority w:val="33"/>
     <w:qFormat/>
     <w:pPr>
@@ -35374,10 +35456,10 @@
       <w:spacing w:val="5"/>
     </w:rPr>
   </w:style>
-  <w:style w:type="paragraph" w:styleId="959">
+  <w:style w:type="paragraph" w:styleId="963">
     <w:name w:val="Header"/>
-    <w:basedOn w:val="987"/>
-    <w:link w:val="960"/>
+    <w:basedOn w:val="991"/>
+    <w:link w:val="964"/>
     <w:uiPriority w:val="99"/>
     <w:unhideWhenUsed/>
     <w:pPr>
@@ -35390,10 +35472,10 @@
       <w:ind/>
     </w:pPr>
   </w:style>
-  <w:style w:type="character" w:styleId="960">
+  <w:style w:type="character" w:styleId="964">
     <w:name w:val="Header Char"/>
-    <w:basedOn w:val="984"/>
-    <w:link w:val="959"/>
+    <w:basedOn w:val="988"/>
+    <w:link w:val="963"/>
     <w:uiPriority w:val="99"/>
     <w:pPr>
       <w:pBdr/>
@@ -35401,10 +35483,10 @@
       <w:ind/>
     </w:pPr>
   </w:style>
-  <w:style w:type="paragraph" w:styleId="961">
+  <w:style w:type="paragraph" w:styleId="965">
     <w:name w:val="Footer"/>
-    <w:basedOn w:val="987"/>
-    <w:link w:val="962"/>
+    <w:basedOn w:val="991"/>
+    <w:link w:val="966"/>
     <w:uiPriority w:val="99"/>
     <w:unhideWhenUsed/>
     <w:pPr>
@@ -35417,10 +35499,10 @@
       <w:ind/>
     </w:pPr>
   </w:style>
-  <w:style w:type="character" w:styleId="962">
+  <w:style w:type="character" w:styleId="966">
     <w:name w:val="Footer Char"/>
-    <w:basedOn w:val="984"/>
-    <w:link w:val="961"/>
+    <w:basedOn w:val="988"/>
+    <w:link w:val="965"/>
     <w:uiPriority w:val="99"/>
     <w:pPr>
       <w:pBdr/>
@@ -35428,10 +35510,10 @@
       <w:ind/>
     </w:pPr>
   </w:style>
-  <w:style w:type="paragraph" w:styleId="963">
+  <w:style w:type="paragraph" w:styleId="967">
     <w:name w:val="Caption"/>
-    <w:basedOn w:val="987"/>
-    <w:next w:val="987"/>
+    <w:basedOn w:val="991"/>
+    <w:next w:val="991"/>
     <w:uiPriority w:val="35"/>
     <w:unhideWhenUsed/>
     <w:qFormat/>
@@ -35448,10 +35530,10 @@
       <w:szCs w:val="18"/>
     </w:rPr>
   </w:style>
-  <w:style w:type="paragraph" w:styleId="964">
+  <w:style w:type="paragraph" w:styleId="968">
     <w:name w:val="footnote text"/>
-    <w:basedOn w:val="987"/>
-    <w:link w:val="965"/>
+    <w:basedOn w:val="991"/>
+    <w:link w:val="969"/>
     <w:uiPriority w:val="99"/>
     <w:semiHidden/>
     <w:unhideWhenUsed/>
@@ -35465,10 +35547,10 @@
       <w:szCs w:val="20"/>
     </w:rPr>
   </w:style>
-  <w:style w:type="character" w:styleId="965">
+  <w:style w:type="character" w:styleId="969">
     <w:name w:val="Footnote Text Char"/>
-    <w:basedOn w:val="984"/>
-    <w:link w:val="964"/>
+    <w:basedOn w:val="988"/>
+    <w:link w:val="968"/>
     <w:uiPriority w:val="99"/>
     <w:semiHidden/>
     <w:pPr>
@@ -35481,9 +35563,9 @@
       <w:szCs w:val="20"/>
     </w:rPr>
   </w:style>
-  <w:style w:type="character" w:styleId="966">
+  <w:style w:type="character" w:styleId="970">
     <w:name w:val="footnote reference"/>
-    <w:basedOn w:val="984"/>
+    <w:basedOn w:val="988"/>
     <w:uiPriority w:val="99"/>
     <w:semiHidden/>
     <w:unhideWhenUsed/>
@@ -35496,10 +35578,10 @@
       <w:vertAlign w:val="superscript"/>
     </w:rPr>
   </w:style>
-  <w:style w:type="paragraph" w:styleId="967">
+  <w:style w:type="paragraph" w:styleId="971">
     <w:name w:val="endnote text"/>
-    <w:basedOn w:val="987"/>
-    <w:link w:val="968"/>
+    <w:basedOn w:val="991"/>
+    <w:link w:val="972"/>
     <w:uiPriority w:val="99"/>
     <w:semiHidden/>
     <w:unhideWhenUsed/>
@@ -35513,10 +35595,10 @@
       <w:szCs w:val="20"/>
     </w:rPr>
   </w:style>
-  <w:style w:type="character" w:styleId="968">
+  <w:style w:type="character" w:styleId="972">
     <w:name w:val="Endnote Text Char"/>
-    <w:basedOn w:val="984"/>
-    <w:link w:val="967"/>
+    <w:basedOn w:val="988"/>
+    <w:link w:val="971"/>
     <w:uiPriority w:val="99"/>
     <w:semiHidden/>
     <w:pPr>
@@ -35529,9 +35611,9 @@
       <w:szCs w:val="20"/>
     </w:rPr>
   </w:style>
-  <w:style w:type="character" w:styleId="969">
+  <w:style w:type="character" w:styleId="973">
     <w:name w:val="endnote reference"/>
-    <w:basedOn w:val="984"/>
+    <w:basedOn w:val="988"/>
     <w:uiPriority w:val="99"/>
     <w:semiHidden/>
     <w:unhideWhenUsed/>
@@ -35544,9 +35626,9 @@
       <w:vertAlign w:val="superscript"/>
     </w:rPr>
   </w:style>
-  <w:style w:type="character" w:styleId="970">
+  <w:style w:type="character" w:styleId="974">
     <w:name w:val="Hyperlink"/>
-    <w:basedOn w:val="984"/>
+    <w:basedOn w:val="988"/>
     <w:uiPriority w:val="99"/>
     <w:unhideWhenUsed/>
     <w:pPr>
@@ -35559,9 +35641,9 @@
       <w:u w:val="single"/>
     </w:rPr>
   </w:style>
-  <w:style w:type="character" w:styleId="971">
+  <w:style w:type="character" w:styleId="975">
     <w:name w:val="FollowedHyperlink"/>
-    <w:basedOn w:val="984"/>
+    <w:basedOn w:val="988"/>
     <w:uiPriority w:val="99"/>
     <w:semiHidden/>
     <w:unhideWhenUsed/>
@@ -35575,10 +35657,10 @@
       <w:u w:val="single"/>
     </w:rPr>
   </w:style>
-  <w:style w:type="paragraph" w:styleId="972">
+  <w:style w:type="paragraph" w:styleId="976">
     <w:name w:val="toc 1"/>
-    <w:basedOn w:val="987"/>
-    <w:next w:val="987"/>
+    <w:basedOn w:val="991"/>
+    <w:next w:val="991"/>
     <w:uiPriority w:val="39"/>
     <w:unhideWhenUsed/>
     <w:pPr>
@@ -35587,10 +35669,10 @@
       <w:ind/>
     </w:pPr>
   </w:style>
-  <w:style w:type="paragraph" w:styleId="973">
+  <w:style w:type="paragraph" w:styleId="977">
     <w:name w:val="toc 2"/>
-    <w:basedOn w:val="987"/>
-    <w:next w:val="987"/>
+    <w:basedOn w:val="991"/>
+    <w:next w:val="991"/>
     <w:uiPriority w:val="39"/>
     <w:unhideWhenUsed/>
     <w:pPr>
@@ -35599,10 +35681,10 @@
       <w:ind w:left="220"/>
     </w:pPr>
   </w:style>
-  <w:style w:type="paragraph" w:styleId="974">
+  <w:style w:type="paragraph" w:styleId="978">
     <w:name w:val="toc 3"/>
-    <w:basedOn w:val="987"/>
-    <w:next w:val="987"/>
+    <w:basedOn w:val="991"/>
+    <w:next w:val="991"/>
     <w:uiPriority w:val="39"/>
     <w:unhideWhenUsed/>
     <w:pPr>
@@ -35611,10 +35693,10 @@
       <w:ind w:left="440"/>
     </w:pPr>
   </w:style>
-  <w:style w:type="paragraph" w:styleId="975">
+  <w:style w:type="paragraph" w:styleId="979">
     <w:name w:val="toc 4"/>
-    <w:basedOn w:val="987"/>
-    <w:next w:val="987"/>
+    <w:basedOn w:val="991"/>
+    <w:next w:val="991"/>
     <w:uiPriority w:val="39"/>
     <w:unhideWhenUsed/>
     <w:pPr>
@@ -35623,10 +35705,10 @@
       <w:ind w:left="660"/>
     </w:pPr>
   </w:style>
-  <w:style w:type="paragraph" w:styleId="976">
+  <w:style w:type="paragraph" w:styleId="980">
     <w:name w:val="toc 5"/>
-    <w:basedOn w:val="987"/>
-    <w:next w:val="987"/>
+    <w:basedOn w:val="991"/>
+    <w:next w:val="991"/>
     <w:uiPriority w:val="39"/>
     <w:unhideWhenUsed/>
     <w:pPr>
@@ -35635,10 +35717,10 @@
       <w:ind w:left="880"/>
     </w:pPr>
   </w:style>
-  <w:style w:type="paragraph" w:styleId="977">
+  <w:style w:type="paragraph" w:styleId="981">
     <w:name w:val="toc 6"/>
-    <w:basedOn w:val="987"/>
-    <w:next w:val="987"/>
+    <w:basedOn w:val="991"/>
+    <w:next w:val="991"/>
     <w:uiPriority w:val="39"/>
     <w:unhideWhenUsed/>
     <w:pPr>
@@ -35647,10 +35729,10 @@
       <w:ind w:left="1100"/>
     </w:pPr>
   </w:style>
-  <w:style w:type="paragraph" w:styleId="978">
+  <w:style w:type="paragraph" w:styleId="982">
     <w:name w:val="toc 7"/>
-    <w:basedOn w:val="987"/>
-    <w:next w:val="987"/>
+    <w:basedOn w:val="991"/>
+    <w:next w:val="991"/>
     <w:uiPriority w:val="39"/>
     <w:unhideWhenUsed/>
     <w:pPr>
@@ -35659,10 +35741,10 @@
       <w:ind w:left="1320"/>
     </w:pPr>
   </w:style>
-  <w:style w:type="paragraph" w:styleId="979">
+  <w:style w:type="paragraph" w:styleId="983">
     <w:name w:val="toc 8"/>
-    <w:basedOn w:val="987"/>
-    <w:next w:val="987"/>
+    <w:basedOn w:val="991"/>
+    <w:next w:val="991"/>
     <w:uiPriority w:val="39"/>
     <w:unhideWhenUsed/>
     <w:pPr>
@@ -35671,10 +35753,10 @@
       <w:ind w:left="1540"/>
     </w:pPr>
   </w:style>
-  <w:style w:type="paragraph" w:styleId="980">
+  <w:style w:type="paragraph" w:styleId="984">
     <w:name w:val="toc 9"/>
-    <w:basedOn w:val="987"/>
-    <w:next w:val="987"/>
+    <w:basedOn w:val="991"/>
+    <w:next w:val="991"/>
     <w:uiPriority w:val="39"/>
     <w:unhideWhenUsed/>
     <w:pPr>
@@ -35683,9 +35765,9 @@
       <w:ind w:left="1760"/>
     </w:pPr>
   </w:style>
-  <w:style w:type="character" w:styleId="981">
+  <w:style w:type="character" w:styleId="985">
     <w:name w:val="Placeholder Text"/>
-    <w:basedOn w:val="984"/>
+    <w:basedOn w:val="988"/>
     <w:uiPriority w:val="99"/>
     <w:semiHidden/>
     <w:pPr>
@@ -35697,7 +35779,7 @@
       <w:color w:val="666666"/>
     </w:rPr>
   </w:style>
-  <w:style w:type="paragraph" w:styleId="982">
+  <w:style w:type="paragraph" w:styleId="986">
     <w:name w:val="TOC Heading"/>
     <w:uiPriority w:val="39"/>
     <w:unhideWhenUsed/>
@@ -35707,10 +35789,10 @@
       <w:ind/>
     </w:pPr>
   </w:style>
-  <w:style w:type="paragraph" w:styleId="983">
+  <w:style w:type="paragraph" w:styleId="987">
     <w:name w:val="table of figures"/>
-    <w:basedOn w:val="987"/>
-    <w:next w:val="987"/>
+    <w:basedOn w:val="991"/>
+    <w:next w:val="991"/>
     <w:uiPriority w:val="99"/>
     <w:unhideWhenUsed/>
     <w:pPr>
@@ -35719,7 +35801,7 @@
       <w:ind/>
     </w:pPr>
   </w:style>
-  <w:style w:type="character" w:styleId="984" w:default="1">
+  <w:style w:type="character" w:styleId="988" w:default="1">
     <w:name w:val="Default Paragraph Font"/>
     <w:uiPriority w:val="1"/>
     <w:semiHidden/>
@@ -35730,7 +35812,7 @@
       <w:ind/>
     </w:pPr>
   </w:style>
-  <w:style w:type="table" w:styleId="985">
+  <w:style w:type="table" w:styleId="989">
     <w:name w:val="Table Normal"/>
     <w:uiPriority w:val="2"/>
     <w:semiHidden/>
@@ -35924,7 +36006,7 @@
       </w:tcPr>
     </w:tblStylePr>
   </w:style>
-  <w:style w:type="numbering" w:styleId="986" w:default="1">
+  <w:style w:type="numbering" w:styleId="990" w:default="1">
     <w:name w:val="No List"/>
     <w:uiPriority w:val="99"/>
     <w:semiHidden/>
@@ -35935,7 +36017,7 @@
       <w:ind/>
     </w:pPr>
   </w:style>
-  <w:style w:type="paragraph" w:styleId="987" w:default="1">
+  <w:style w:type="paragraph" w:styleId="991" w:default="1">
     <w:name w:val="Normal"/>
     <w:uiPriority w:val="1"/>
     <w:qFormat/>
@@ -35949,9 +36031,9 @@
       <w:lang w:val="es-ES" w:eastAsia="en-US" w:bidi="ar-SA"/>
     </w:rPr>
   </w:style>
-  <w:style w:type="paragraph" w:styleId="988">
+  <w:style w:type="paragraph" w:styleId="992">
     <w:name w:val="Body Text"/>
-    <w:basedOn w:val="987"/>
+    <w:basedOn w:val="991"/>
     <w:uiPriority w:val="1"/>
     <w:qFormat/>
     <w:pPr>
@@ -35966,9 +36048,9 @@
       <w:lang w:val="es-ES" w:eastAsia="en-US" w:bidi="ar-SA"/>
     </w:rPr>
   </w:style>
-  <w:style w:type="paragraph" w:styleId="989">
+  <w:style w:type="paragraph" w:styleId="993">
     <w:name w:val="Heading 1"/>
-    <w:basedOn w:val="987"/>
+    <w:basedOn w:val="991"/>
     <w:uiPriority w:val="1"/>
     <w:qFormat/>
     <w:pPr>
@@ -35984,9 +36066,9 @@
       <w:lang w:val="es-ES" w:eastAsia="en-US" w:bidi="ar-SA"/>
     </w:rPr>
   </w:style>
-  <w:style w:type="paragraph" w:styleId="990">
+  <w:style w:type="paragraph" w:styleId="994">
     <w:name w:val="List Paragraph"/>
-    <w:basedOn w:val="987"/>
+    <w:basedOn w:val="991"/>
     <w:uiPriority w:val="1"/>
     <w:qFormat/>
     <w:pPr>
@@ -36000,9 +36082,9 @@
       <w:lang w:val="es-ES" w:eastAsia="en-US" w:bidi="ar-SA"/>
     </w:rPr>
   </w:style>
-  <w:style w:type="paragraph" w:styleId="991">
+  <w:style w:type="paragraph" w:styleId="995">
     <w:name w:val="Table Paragraph"/>
-    <w:basedOn w:val="987"/>
+    <w:basedOn w:val="991"/>
     <w:uiPriority w:val="1"/>
     <w:qFormat/>
     <w:pPr>

</xml_diff>